<commit_message>
Production order & general contract report
</commit_message>
<xml_diff>
--- a/APLOS/POPResources/Templates/JobWorkIssue20202.docx
+++ b/APLOS/POPResources/Templates/JobWorkIssue20202.docx
@@ -1,6 +1,6 @@
 
 <file path=word/document.xml><?xml version="1.0" encoding="utf-8"?>
-<w:document xmlns:wpc="http://schemas.microsoft.com/office/word/2010/wordprocessingCanvas" xmlns:cx="http://schemas.microsoft.com/office/drawing/2014/chartex" xmlns:cx1="http://schemas.microsoft.com/office/drawing/2015/9/8/chartex" xmlns:cx2="http://schemas.microsoft.com/office/drawing/2015/10/21/chartex" xmlns:cx3="http://schemas.microsoft.com/office/drawing/2016/5/9/chartex" xmlns:cx4="http://schemas.microsoft.com/office/drawing/2016/5/10/chartex" xmlns:cx5="http://schemas.microsoft.com/office/drawing/2016/5/11/chartex" xmlns:cx6="http://schemas.microsoft.com/office/drawing/2016/5/12/chartex" xmlns:cx7="http://schemas.microsoft.com/office/drawing/2016/5/13/chartex" xmlns:cx8="http://schemas.microsoft.com/office/drawing/2016/5/14/chartex" xmlns:mc="http://schemas.openxmlformats.org/markup-compatibility/2006" xmlns:aink="http://schemas.microsoft.com/office/drawing/2016/ink" xmlns:am3d="http://schemas.microsoft.com/office/drawing/2017/model3d" xmlns:o="urn:schemas-microsoft-com:office:office" xmlns:r="http://schemas.openxmlformats.org/officeDocument/2006/relationships" xmlns:m="http://schemas.openxmlformats.org/officeDocument/2006/math" xmlns:v="urn:schemas-microsoft-com:vml" xmlns:wp14="http://schemas.microsoft.com/office/word/2010/wordprocessingDrawing" xmlns:wp="http://schemas.openxmlformats.org/drawingml/2006/wordprocessingDrawing" xmlns:w10="urn:schemas-microsoft-com:office:word" xmlns:w="http://schemas.openxmlformats.org/wordprocessingml/2006/main" xmlns:w14="http://schemas.microsoft.com/office/word/2010/wordml" xmlns:w15="http://schemas.microsoft.com/office/word/2012/wordml" xmlns:w16cex="http://schemas.microsoft.com/office/word/2018/wordml/cex" xmlns:w16cid="http://schemas.microsoft.com/office/word/2016/wordml/cid" xmlns:w16="http://schemas.microsoft.com/office/word/2018/wordml" xmlns:w16sdtdh="http://schemas.microsoft.com/office/word/2020/wordml/sdtdatahash" xmlns:w16se="http://schemas.microsoft.com/office/word/2015/wordml/symex" xmlns:wpg="http://schemas.microsoft.com/office/word/2010/wordprocessingGroup" xmlns:wpi="http://schemas.microsoft.com/office/word/2010/wordprocessingInk" xmlns:wne="http://schemas.microsoft.com/office/word/2006/wordml" xmlns:wps="http://schemas.microsoft.com/office/word/2010/wordprocessingShape" mc:Ignorable="w14 w15 w16se w16cid w16 w16cex w16sdtdh wp14">
+<w:document xmlns:wpc="http://schemas.microsoft.com/office/word/2010/wordprocessingCanvas" xmlns:cx="http://schemas.microsoft.com/office/drawing/2014/chartex" xmlns:cx1="http://schemas.microsoft.com/office/drawing/2015/9/8/chartex" xmlns:cx2="http://schemas.microsoft.com/office/drawing/2015/10/21/chartex" xmlns:cx3="http://schemas.microsoft.com/office/drawing/2016/5/9/chartex" xmlns:cx4="http://schemas.microsoft.com/office/drawing/2016/5/10/chartex" xmlns:cx5="http://schemas.microsoft.com/office/drawing/2016/5/11/chartex" xmlns:cx6="http://schemas.microsoft.com/office/drawing/2016/5/12/chartex" xmlns:cx7="http://schemas.microsoft.com/office/drawing/2016/5/13/chartex" xmlns:cx8="http://schemas.microsoft.com/office/drawing/2016/5/14/chartex" xmlns:mc="http://schemas.openxmlformats.org/markup-compatibility/2006" xmlns:aink="http://schemas.microsoft.com/office/drawing/2016/ink" xmlns:am3d="http://schemas.microsoft.com/office/drawing/2017/model3d" xmlns:o="urn:schemas-microsoft-com:office:office" xmlns:oel="http://schemas.microsoft.com/office/2019/extlst" xmlns:r="http://schemas.openxmlformats.org/officeDocument/2006/relationships" xmlns:m="http://schemas.openxmlformats.org/officeDocument/2006/math" xmlns:v="urn:schemas-microsoft-com:vml" xmlns:wp14="http://schemas.microsoft.com/office/word/2010/wordprocessingDrawing" xmlns:wp="http://schemas.openxmlformats.org/drawingml/2006/wordprocessingDrawing" xmlns:w10="urn:schemas-microsoft-com:office:word" xmlns:w="http://schemas.openxmlformats.org/wordprocessingml/2006/main" xmlns:w14="http://schemas.microsoft.com/office/word/2010/wordml" xmlns:w15="http://schemas.microsoft.com/office/word/2012/wordml" xmlns:w16cex="http://schemas.microsoft.com/office/word/2018/wordml/cex" xmlns:w16cid="http://schemas.microsoft.com/office/word/2016/wordml/cid" xmlns:w16="http://schemas.microsoft.com/office/word/2018/wordml" xmlns:w16sdtdh="http://schemas.microsoft.com/office/word/2020/wordml/sdtdatahash" xmlns:w16se="http://schemas.microsoft.com/office/word/2015/wordml/symex" xmlns:wpg="http://schemas.microsoft.com/office/word/2010/wordprocessingGroup" xmlns:wpi="http://schemas.microsoft.com/office/word/2010/wordprocessingInk" xmlns:wne="http://schemas.microsoft.com/office/word/2006/wordml" xmlns:wps="http://schemas.microsoft.com/office/word/2010/wordprocessingShape" mc:Ignorable="w14 w15 w16se w16cid w16 w16cex w16sdtdh wp14">
   <w:body>
     <w:p>
       <w:pPr>
@@ -23,172 +23,7 @@
         <mc:AlternateContent>
           <mc:Choice Requires="wps">
             <w:drawing>
-              <wp:anchor distT="0" distB="0" distL="114300" distR="114300" simplePos="0" relativeHeight="251661312" behindDoc="0" locked="0" layoutInCell="1" allowOverlap="1" wp14:anchorId="26C6AB2B" wp14:editId="2A5B8BD1">
-                <wp:simplePos x="0" y="0"/>
-                <wp:positionH relativeFrom="column">
-                  <wp:posOffset>-3402330</wp:posOffset>
-                </wp:positionH>
-                <wp:positionV relativeFrom="paragraph">
-                  <wp:posOffset>-341630</wp:posOffset>
-                </wp:positionV>
-                <wp:extent cx="1704975" cy="238125"/>
-                <wp:effectExtent l="0" t="0" r="28575" b="28575"/>
-                <wp:wrapNone/>
-                <wp:docPr id="9" name="Rectangle 9"/>
-                <wp:cNvGraphicFramePr/>
-                <a:graphic xmlns:a="http://schemas.openxmlformats.org/drawingml/2006/main">
-                  <a:graphicData uri="http://schemas.microsoft.com/office/word/2010/wordprocessingShape">
-                    <wps:wsp>
-                      <wps:cNvSpPr/>
-                      <wps:spPr>
-                        <a:xfrm>
-                          <a:off x="0" y="0"/>
-                          <a:ext cx="1704975" cy="238125"/>
-                        </a:xfrm>
-                        <a:prstGeom prst="rect">
-                          <a:avLst/>
-                        </a:prstGeom>
-                        <a:ln>
-                          <a:solidFill>
-                            <a:schemeClr val="bg1"/>
-                          </a:solidFill>
-                        </a:ln>
-                      </wps:spPr>
-                      <wps:style>
-                        <a:lnRef idx="2">
-                          <a:schemeClr val="accent3"/>
-                        </a:lnRef>
-                        <a:fillRef idx="1">
-                          <a:schemeClr val="lt1"/>
-                        </a:fillRef>
-                        <a:effectRef idx="0">
-                          <a:schemeClr val="accent3"/>
-                        </a:effectRef>
-                        <a:fontRef idx="minor">
-                          <a:schemeClr val="dk1"/>
-                        </a:fontRef>
-                      </wps:style>
-                      <wps:txbx>
-                        <w:txbxContent>
-                          <w:p>
-                            <w:pPr>
-                              <w:rPr>
-                                <w:rFonts w:ascii="Tahoma" w:hAnsi="Tahoma" w:cs="Tahoma"/>
-                                <w:b/>
-                                <w:bCs/>
-                                <w:sz w:val="16"/>
-                                <w:szCs w:val="16"/>
-                              </w:rPr>
-                            </w:pPr>
-                            <w:proofErr w:type="spellStart"/>
-                            <w:r>
-                              <w:rPr>
-                                <w:rFonts w:ascii="Tahoma" w:hAnsi="Tahoma" w:cs="Tahoma"/>
-                                <w:b/>
-                                <w:bCs/>
-                                <w:sz w:val="16"/>
-                                <w:szCs w:val="16"/>
-                              </w:rPr>
-                              <w:t>Mouchak</w:t>
-                            </w:r>
-                            <w:proofErr w:type="spellEnd"/>
-                            <w:r>
-                              <w:rPr>
-                                <w:rFonts w:ascii="Tahoma" w:hAnsi="Tahoma" w:cs="Tahoma"/>
-                                <w:b/>
-                                <w:bCs/>
-                                <w:sz w:val="16"/>
-                                <w:szCs w:val="16"/>
-                              </w:rPr>
-                              <w:t xml:space="preserve"> Knit Composite Ltd.</w:t>
-                            </w:r>
-                          </w:p>
-                          <w:p>
-                            <w:pPr>
-                              <w:jc w:val="center"/>
-                            </w:pPr>
-                          </w:p>
-                        </w:txbxContent>
-                      </wps:txbx>
-                      <wps:bodyPr rot="0" spcFirstLastPara="0" vertOverflow="overflow" horzOverflow="overflow" vert="horz" wrap="square" lIns="91440" tIns="45720" rIns="91440" bIns="45720" numCol="1" spcCol="0" rtlCol="0" fromWordArt="0" anchor="ctr" anchorCtr="0" forceAA="0" compatLnSpc="1">
-                        <a:prstTxWarp prst="textNoShape">
-                          <a:avLst/>
-                        </a:prstTxWarp>
-                        <a:noAutofit/>
-                      </wps:bodyPr>
-                    </wps:wsp>
-                  </a:graphicData>
-                </a:graphic>
-                <wp14:sizeRelH relativeFrom="margin">
-                  <wp14:pctWidth>0</wp14:pctWidth>
-                </wp14:sizeRelH>
-                <wp14:sizeRelV relativeFrom="margin">
-                  <wp14:pctHeight>0</wp14:pctHeight>
-                </wp14:sizeRelV>
-              </wp:anchor>
-            </w:drawing>
-          </mc:Choice>
-          <mc:Fallback>
-            <w:pict>
-              <v:rect w14:anchorId="26C6AB2B" id="Rectangle 9" o:spid="_x0000_s1026" style="position:absolute;left:0;text-align:left;margin-left:-267.9pt;margin-top:-26.9pt;width:134.25pt;height:18.75pt;z-index:251661312;visibility:visible;mso-wrap-style:square;mso-width-percent:0;mso-height-percent:0;mso-wrap-distance-left:9pt;mso-wrap-distance-top:0;mso-wrap-distance-right:9pt;mso-wrap-distance-bottom:0;mso-position-horizontal:absolute;mso-position-horizontal-relative:text;mso-position-vertical:absolute;mso-position-vertical-relative:text;mso-width-percent:0;mso-height-percent:0;mso-width-relative:margin;mso-height-relative:margin;v-text-anchor:middle" o:gfxdata="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" fillcolor="white [3201]" strokecolor="white [3212]" strokeweight="1pt">
-                <v:textbox>
-                  <w:txbxContent>
-                    <w:p>
-                      <w:pPr>
-                        <w:rPr>
-                          <w:rFonts w:ascii="Tahoma" w:hAnsi="Tahoma" w:cs="Tahoma"/>
-                          <w:b/>
-                          <w:bCs/>
-                          <w:sz w:val="16"/>
-                          <w:szCs w:val="16"/>
-                        </w:rPr>
-                      </w:pPr>
-                      <w:proofErr w:type="spellStart"/>
-                      <w:r>
-                        <w:rPr>
-                          <w:rFonts w:ascii="Tahoma" w:hAnsi="Tahoma" w:cs="Tahoma"/>
-                          <w:b/>
-                          <w:bCs/>
-                          <w:sz w:val="16"/>
-                          <w:szCs w:val="16"/>
-                        </w:rPr>
-                        <w:t>Mouchak</w:t>
-                      </w:r>
-                      <w:proofErr w:type="spellEnd"/>
-                      <w:r>
-                        <w:rPr>
-                          <w:rFonts w:ascii="Tahoma" w:hAnsi="Tahoma" w:cs="Tahoma"/>
-                          <w:b/>
-                          <w:bCs/>
-                          <w:sz w:val="16"/>
-                          <w:szCs w:val="16"/>
-                        </w:rPr>
-                        <w:t xml:space="preserve"> Knit Composite Ltd.</w:t>
-                      </w:r>
-                    </w:p>
-                    <w:p>
-                      <w:pPr>
-                        <w:jc w:val="center"/>
-                      </w:pPr>
-                    </w:p>
-                  </w:txbxContent>
-                </v:textbox>
-              </v:rect>
-            </w:pict>
-          </mc:Fallback>
-        </mc:AlternateContent>
-      </w:r>
-      <w:r>
-        <w:rPr>
-          <w:rFonts w:ascii="Tahoma" w:hAnsi="Tahoma" w:cs="Tahoma"/>
-          <w:noProof/>
-          <w:sz w:val="20"/>
-          <w:szCs w:val="20"/>
-        </w:rPr>
-        <mc:AlternateContent>
-          <mc:Choice Requires="wps">
-            <w:drawing>
-              <wp:anchor distT="45720" distB="45720" distL="114300" distR="114300" simplePos="0" relativeHeight="251656192" behindDoc="0" locked="0" layoutInCell="1" allowOverlap="1" wp14:anchorId="73EEC8D8" wp14:editId="2B73BEB8">
+              <wp:anchor distT="45720" distB="45720" distL="114300" distR="114300" simplePos="0" relativeHeight="251656192" behindDoc="0" locked="0" layoutInCell="1" allowOverlap="1" wp14:anchorId="73EEC8D8" wp14:editId="0473FB12">
                 <wp:simplePos x="0" y="0"/>
                 <wp:positionH relativeFrom="margin">
                   <wp:posOffset>-266700</wp:posOffset>
@@ -284,7 +119,7 @@
                 <v:stroke joinstyle="miter"/>
                 <v:path gradientshapeok="t" o:connecttype="rect"/>
               </v:shapetype>
-              <v:shape id="Text Box 2" o:spid="_x0000_s1027" type="#_x0000_t202" style="position:absolute;left:0;text-align:left;margin-left:-21pt;margin-top:14.4pt;width:268.8pt;height:20.05pt;z-index:251656192;visibility:visible;mso-wrap-style:square;mso-width-percent:0;mso-height-percent:0;mso-wrap-distance-left:9pt;mso-wrap-distance-top:3.6pt;mso-wrap-distance-right:9pt;mso-wrap-distance-bottom:3.6pt;mso-position-horizontal:absolute;mso-position-horizontal-relative:margin;mso-position-vertical:absolute;mso-position-vertical-relative:text;mso-width-percent:0;mso-height-percent:0;mso-width-relative:margin;mso-height-relative:margin;v-text-anchor:top" o:gfxdata="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" filled="f" stroked="f">
+              <v:shape id="Text Box 2" o:spid="_x0000_s1026" type="#_x0000_t202" style="position:absolute;left:0;text-align:left;margin-left:-21pt;margin-top:14.4pt;width:268.8pt;height:20.05pt;z-index:251656192;visibility:visible;mso-wrap-style:square;mso-width-percent:0;mso-height-percent:0;mso-wrap-distance-left:9pt;mso-wrap-distance-top:3.6pt;mso-wrap-distance-right:9pt;mso-wrap-distance-bottom:3.6pt;mso-position-horizontal:absolute;mso-position-horizontal-relative:margin;mso-position-vertical:absolute;mso-position-vertical-relative:text;mso-width-percent:0;mso-height-percent:0;mso-width-relative:margin;mso-height-relative:margin;v-text-anchor:top" o:gfxdata="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" filled="f" stroked="f">
                 <v:textbox>
                   <w:txbxContent>
                     <w:p>
@@ -2438,7 +2273,7 @@
                       </mc:Choice>
                       <mc:Fallback>
                         <w:pict>
-                          <v:line w14:anchorId="0969BA5F" id="Straight Connector 1" o:spid="_x0000_s1026" style="position:absolute;flip:x;z-index:251682816;visibility:visible;mso-wrap-style:square;mso-width-percent:0;mso-height-percent:0;mso-wrap-distance-left:9pt;mso-wrap-distance-top:0;mso-wrap-distance-right:9pt;mso-wrap-distance-bottom:0;mso-position-horizontal:absolute;mso-position-horizontal-relative:text;mso-position-vertical:absolute;mso-position-vertical-relative:text;mso-width-percent:0;mso-height-percent:0;mso-width-relative:margin;mso-height-relative:margin" from="30.2pt,8.35pt" to="139.75pt,8.35pt" o:gfxdata="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" strokecolor="black [3213]" strokeweight=".5pt">
+                          <v:line w14:anchorId="3D8A28DF" id="Straight Connector 1" o:spid="_x0000_s1026" style="position:absolute;flip:x;z-index:251682816;visibility:visible;mso-wrap-style:square;mso-width-percent:0;mso-height-percent:0;mso-wrap-distance-left:9pt;mso-wrap-distance-top:0;mso-wrap-distance-right:9pt;mso-wrap-distance-bottom:0;mso-position-horizontal:absolute;mso-position-horizontal-relative:text;mso-position-vertical:absolute;mso-position-vertical-relative:text;mso-width-percent:0;mso-height-percent:0;mso-width-relative:margin;mso-height-relative:margin" from="30.2pt,8.35pt" to="139.75pt,8.35pt" o:gfxdata="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" strokecolor="black [3213]" strokeweight=".5pt">
                             <v:stroke joinstyle="miter"/>
                           </v:line>
                         </w:pict>
@@ -2559,7 +2394,7 @@
                       </mc:Choice>
                       <mc:Fallback>
                         <w:pict>
-                          <v:line w14:anchorId="75D2915D" id="Straight Connector 2" o:spid="_x0000_s1026" style="position:absolute;z-index:251685888;visibility:visible;mso-wrap-style:square;mso-wrap-distance-left:9pt;mso-wrap-distance-top:0;mso-wrap-distance-right:9pt;mso-wrap-distance-bottom:0;mso-position-horizontal:absolute;mso-position-horizontal-relative:text;mso-position-vertical:absolute;mso-position-vertical-relative:text" from="31.2pt,8.35pt" to="143.25pt,8.35pt" o:gfxdata="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" strokecolor="black [3213]" strokeweight=".5pt">
+                          <v:line w14:anchorId="2E5FA5DE" id="Straight Connector 2" o:spid="_x0000_s1026" style="position:absolute;z-index:251685888;visibility:visible;mso-wrap-style:square;mso-wrap-distance-left:9pt;mso-wrap-distance-top:0;mso-wrap-distance-right:9pt;mso-wrap-distance-bottom:0;mso-position-horizontal:absolute;mso-position-horizontal-relative:text;mso-position-vertical:absolute;mso-position-vertical-relative:text" from="31.2pt,8.35pt" to="143.25pt,8.35pt" o:gfxdata="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" strokecolor="black [3213]" strokeweight=".5pt">
                             <v:stroke joinstyle="miter"/>
                           </v:line>
                         </w:pict>
@@ -2690,7 +2525,7 @@
                       </mc:Choice>
                       <mc:Fallback>
                         <w:pict>
-                          <v:line w14:anchorId="7A6A491E" id="Straight Connector 3" o:spid="_x0000_s1026" style="position:absolute;z-index:251683840;visibility:visible;mso-wrap-style:square;mso-width-percent:0;mso-wrap-distance-left:9pt;mso-wrap-distance-top:0;mso-wrap-distance-right:9pt;mso-wrap-distance-bottom:0;mso-position-horizontal:absolute;mso-position-horizontal-relative:text;mso-position-vertical:absolute;mso-position-vertical-relative:text;mso-width-percent:0;mso-width-relative:margin" from="23.5pt,8.35pt" to="143.7pt,8.35pt" o:gfxdata="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" strokecolor="black [3213]" strokeweight=".5pt">
+                          <v:line w14:anchorId="1F26EB42" id="Straight Connector 3" o:spid="_x0000_s1026" style="position:absolute;z-index:251683840;visibility:visible;mso-wrap-style:square;mso-width-percent:0;mso-wrap-distance-left:9pt;mso-wrap-distance-top:0;mso-wrap-distance-right:9pt;mso-wrap-distance-bottom:0;mso-position-horizontal:absolute;mso-position-horizontal-relative:text;mso-position-vertical:absolute;mso-position-vertical-relative:text;mso-width-percent:0;mso-width-relative:margin" from="23.5pt,8.35pt" to="143.7pt,8.35pt" o:gfxdata="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" strokecolor="black [3213]" strokeweight=".5pt">
                             <v:stroke joinstyle="miter"/>
                           </v:line>
                         </w:pict>
@@ -2809,7 +2644,7 @@
                       </mc:Choice>
                       <mc:Fallback>
                         <w:pict>
-                          <v:line w14:anchorId="260B972B" id="Straight Connector 5" o:spid="_x0000_s1026" style="position:absolute;z-index:251684864;visibility:visible;mso-wrap-style:square;mso-wrap-distance-left:9pt;mso-wrap-distance-top:0;mso-wrap-distance-right:9pt;mso-wrap-distance-bottom:0;mso-position-horizontal:absolute;mso-position-horizontal-relative:text;mso-position-vertical:absolute;mso-position-vertical-relative:text" from="31.2pt,8.35pt" to="143.25pt,8.35pt" o:gfxdata="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" strokecolor="black [3213]" strokeweight=".5pt">
+                          <v:line w14:anchorId="4F051361" id="Straight Connector 5" o:spid="_x0000_s1026" style="position:absolute;z-index:251684864;visibility:visible;mso-wrap-style:square;mso-wrap-distance-left:9pt;mso-wrap-distance-top:0;mso-wrap-distance-right:9pt;mso-wrap-distance-bottom:0;mso-position-horizontal:absolute;mso-position-horizontal-relative:text;mso-position-vertical:absolute;mso-position-vertical-relative:text" from="31.2pt,8.35pt" to="143.25pt,8.35pt" o:gfxdata="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" strokecolor="black [3213]" strokeweight=".5pt">
                             <v:stroke joinstyle="miter"/>
                           </v:line>
                         </w:pict>
@@ -3034,8 +2869,12 @@
       </w:pPr>
     </w:p>
     <w:sectPr>
-      <w:headerReference w:type="default" r:id="rId8"/>
-      <w:footerReference w:type="default" r:id="rId9"/>
+      <w:headerReference w:type="even" r:id="rId8"/>
+      <w:headerReference w:type="default" r:id="rId9"/>
+      <w:footerReference w:type="even" r:id="rId10"/>
+      <w:footerReference w:type="default" r:id="rId11"/>
+      <w:headerReference w:type="first" r:id="rId12"/>
+      <w:footerReference w:type="first" r:id="rId13"/>
       <w:pgSz w:w="20160" w:h="12240" w:orient="landscape" w:code="5"/>
       <w:pgMar w:top="1800" w:right="1440" w:bottom="1800" w:left="1440" w:header="0" w:footer="0" w:gutter="0"/>
       <w:cols w:space="720"/>
@@ -3046,7 +2885,7 @@
 </file>
 
 <file path=word/endnotes.xml><?xml version="1.0" encoding="utf-8"?>
-<w:endnotes xmlns:wpc="http://schemas.microsoft.com/office/word/2010/wordprocessingCanvas" xmlns:cx="http://schemas.microsoft.com/office/drawing/2014/chartex" xmlns:cx1="http://schemas.microsoft.com/office/drawing/2015/9/8/chartex" xmlns:cx2="http://schemas.microsoft.com/office/drawing/2015/10/21/chartex" xmlns:cx3="http://schemas.microsoft.com/office/drawing/2016/5/9/chartex" xmlns:cx4="http://schemas.microsoft.com/office/drawing/2016/5/10/chartex" xmlns:cx5="http://schemas.microsoft.com/office/drawing/2016/5/11/chartex" xmlns:cx6="http://schemas.microsoft.com/office/drawing/2016/5/12/chartex" xmlns:cx7="http://schemas.microsoft.com/office/drawing/2016/5/13/chartex" xmlns:cx8="http://schemas.microsoft.com/office/drawing/2016/5/14/chartex" xmlns:mc="http://schemas.openxmlformats.org/markup-compatibility/2006" xmlns:aink="http://schemas.microsoft.com/office/drawing/2016/ink" xmlns:am3d="http://schemas.microsoft.com/office/drawing/2017/model3d" xmlns:o="urn:schemas-microsoft-com:office:office" xmlns:r="http://schemas.openxmlformats.org/officeDocument/2006/relationships" xmlns:m="http://schemas.openxmlformats.org/officeDocument/2006/math" xmlns:v="urn:schemas-microsoft-com:vml" xmlns:wp14="http://schemas.microsoft.com/office/word/2010/wordprocessingDrawing" xmlns:wp="http://schemas.openxmlformats.org/drawingml/2006/wordprocessingDrawing" xmlns:w10="urn:schemas-microsoft-com:office:word" xmlns:w="http://schemas.openxmlformats.org/wordprocessingml/2006/main" xmlns:w14="http://schemas.microsoft.com/office/word/2010/wordml" xmlns:w15="http://schemas.microsoft.com/office/word/2012/wordml" xmlns:w16cex="http://schemas.microsoft.com/office/word/2018/wordml/cex" xmlns:w16cid="http://schemas.microsoft.com/office/word/2016/wordml/cid" xmlns:w16="http://schemas.microsoft.com/office/word/2018/wordml" xmlns:w16sdtdh="http://schemas.microsoft.com/office/word/2020/wordml/sdtdatahash" xmlns:w16se="http://schemas.microsoft.com/office/word/2015/wordml/symex" xmlns:wpg="http://schemas.microsoft.com/office/word/2010/wordprocessingGroup" xmlns:wpi="http://schemas.microsoft.com/office/word/2010/wordprocessingInk" xmlns:wne="http://schemas.microsoft.com/office/word/2006/wordml" xmlns:wps="http://schemas.microsoft.com/office/word/2010/wordprocessingShape" mc:Ignorable="w14 w15 w16se w16cid w16 w16cex w16sdtdh wp14">
+<w:endnotes xmlns:wpc="http://schemas.microsoft.com/office/word/2010/wordprocessingCanvas" xmlns:cx="http://schemas.microsoft.com/office/drawing/2014/chartex" xmlns:cx1="http://schemas.microsoft.com/office/drawing/2015/9/8/chartex" xmlns:cx2="http://schemas.microsoft.com/office/drawing/2015/10/21/chartex" xmlns:cx3="http://schemas.microsoft.com/office/drawing/2016/5/9/chartex" xmlns:cx4="http://schemas.microsoft.com/office/drawing/2016/5/10/chartex" xmlns:cx5="http://schemas.microsoft.com/office/drawing/2016/5/11/chartex" xmlns:cx6="http://schemas.microsoft.com/office/drawing/2016/5/12/chartex" xmlns:cx7="http://schemas.microsoft.com/office/drawing/2016/5/13/chartex" xmlns:cx8="http://schemas.microsoft.com/office/drawing/2016/5/14/chartex" xmlns:mc="http://schemas.openxmlformats.org/markup-compatibility/2006" xmlns:aink="http://schemas.microsoft.com/office/drawing/2016/ink" xmlns:am3d="http://schemas.microsoft.com/office/drawing/2017/model3d" xmlns:o="urn:schemas-microsoft-com:office:office" xmlns:oel="http://schemas.microsoft.com/office/2019/extlst" xmlns:r="http://schemas.openxmlformats.org/officeDocument/2006/relationships" xmlns:m="http://schemas.openxmlformats.org/officeDocument/2006/math" xmlns:v="urn:schemas-microsoft-com:vml" xmlns:wp14="http://schemas.microsoft.com/office/word/2010/wordprocessingDrawing" xmlns:wp="http://schemas.openxmlformats.org/drawingml/2006/wordprocessingDrawing" xmlns:w10="urn:schemas-microsoft-com:office:word" xmlns:w="http://schemas.openxmlformats.org/wordprocessingml/2006/main" xmlns:w14="http://schemas.microsoft.com/office/word/2010/wordml" xmlns:w15="http://schemas.microsoft.com/office/word/2012/wordml" xmlns:w16cex="http://schemas.microsoft.com/office/word/2018/wordml/cex" xmlns:w16cid="http://schemas.microsoft.com/office/word/2016/wordml/cid" xmlns:w16="http://schemas.microsoft.com/office/word/2018/wordml" xmlns:w16sdtdh="http://schemas.microsoft.com/office/word/2020/wordml/sdtdatahash" xmlns:w16se="http://schemas.microsoft.com/office/word/2015/wordml/symex" xmlns:wpg="http://schemas.microsoft.com/office/word/2010/wordprocessingGroup" xmlns:wpi="http://schemas.microsoft.com/office/word/2010/wordprocessingInk" xmlns:wne="http://schemas.microsoft.com/office/word/2006/wordml" xmlns:wps="http://schemas.microsoft.com/office/word/2010/wordprocessingShape" mc:Ignorable="w14 w15 w16se w16cid w16 w16cex w16sdtdh wp14">
   <w:endnote w:type="separator" w:id="-1">
     <w:p>
       <w:r>
@@ -3065,7 +2904,17 @@
 </file>
 
 <file path=word/footer1.xml><?xml version="1.0" encoding="utf-8"?>
-<w:ftr xmlns:wpc="http://schemas.microsoft.com/office/word/2010/wordprocessingCanvas" xmlns:cx="http://schemas.microsoft.com/office/drawing/2014/chartex" xmlns:cx1="http://schemas.microsoft.com/office/drawing/2015/9/8/chartex" xmlns:cx2="http://schemas.microsoft.com/office/drawing/2015/10/21/chartex" xmlns:cx3="http://schemas.microsoft.com/office/drawing/2016/5/9/chartex" xmlns:cx4="http://schemas.microsoft.com/office/drawing/2016/5/10/chartex" xmlns:cx5="http://schemas.microsoft.com/office/drawing/2016/5/11/chartex" xmlns:cx6="http://schemas.microsoft.com/office/drawing/2016/5/12/chartex" xmlns:cx7="http://schemas.microsoft.com/office/drawing/2016/5/13/chartex" xmlns:cx8="http://schemas.microsoft.com/office/drawing/2016/5/14/chartex" xmlns:mc="http://schemas.openxmlformats.org/markup-compatibility/2006" xmlns:aink="http://schemas.microsoft.com/office/drawing/2016/ink" xmlns:am3d="http://schemas.microsoft.com/office/drawing/2017/model3d" xmlns:o="urn:schemas-microsoft-com:office:office" xmlns:r="http://schemas.openxmlformats.org/officeDocument/2006/relationships" xmlns:m="http://schemas.openxmlformats.org/officeDocument/2006/math" xmlns:v="urn:schemas-microsoft-com:vml" xmlns:wp14="http://schemas.microsoft.com/office/word/2010/wordprocessingDrawing" xmlns:wp="http://schemas.openxmlformats.org/drawingml/2006/wordprocessingDrawing" xmlns:w10="urn:schemas-microsoft-com:office:word" xmlns:w="http://schemas.openxmlformats.org/wordprocessingml/2006/main" xmlns:w14="http://schemas.microsoft.com/office/word/2010/wordml" xmlns:w15="http://schemas.microsoft.com/office/word/2012/wordml" xmlns:w16cex="http://schemas.microsoft.com/office/word/2018/wordml/cex" xmlns:w16cid="http://schemas.microsoft.com/office/word/2016/wordml/cid" xmlns:w16="http://schemas.microsoft.com/office/word/2018/wordml" xmlns:w16sdtdh="http://schemas.microsoft.com/office/word/2020/wordml/sdtdatahash" xmlns:w16se="http://schemas.microsoft.com/office/word/2015/wordml/symex" xmlns:wpg="http://schemas.microsoft.com/office/word/2010/wordprocessingGroup" xmlns:wpi="http://schemas.microsoft.com/office/word/2010/wordprocessingInk" xmlns:wne="http://schemas.microsoft.com/office/word/2006/wordml" xmlns:wps="http://schemas.microsoft.com/office/word/2010/wordprocessingShape" mc:Ignorable="w14 w15 w16se w16cid w16 w16cex w16sdtdh wp14">
+<w:ftr xmlns:wpc="http://schemas.microsoft.com/office/word/2010/wordprocessingCanvas" xmlns:cx="http://schemas.microsoft.com/office/drawing/2014/chartex" xmlns:cx1="http://schemas.microsoft.com/office/drawing/2015/9/8/chartex" xmlns:cx2="http://schemas.microsoft.com/office/drawing/2015/10/21/chartex" xmlns:cx3="http://schemas.microsoft.com/office/drawing/2016/5/9/chartex" xmlns:cx4="http://schemas.microsoft.com/office/drawing/2016/5/10/chartex" xmlns:cx5="http://schemas.microsoft.com/office/drawing/2016/5/11/chartex" xmlns:cx6="http://schemas.microsoft.com/office/drawing/2016/5/12/chartex" xmlns:cx7="http://schemas.microsoft.com/office/drawing/2016/5/13/chartex" xmlns:cx8="http://schemas.microsoft.com/office/drawing/2016/5/14/chartex" xmlns:mc="http://schemas.openxmlformats.org/markup-compatibility/2006" xmlns:aink="http://schemas.microsoft.com/office/drawing/2016/ink" xmlns:am3d="http://schemas.microsoft.com/office/drawing/2017/model3d" xmlns:o="urn:schemas-microsoft-com:office:office" xmlns:oel="http://schemas.microsoft.com/office/2019/extlst" xmlns:r="http://schemas.openxmlformats.org/officeDocument/2006/relationships" xmlns:m="http://schemas.openxmlformats.org/officeDocument/2006/math" xmlns:v="urn:schemas-microsoft-com:vml" xmlns:wp14="http://schemas.microsoft.com/office/word/2010/wordprocessingDrawing" xmlns:wp="http://schemas.openxmlformats.org/drawingml/2006/wordprocessingDrawing" xmlns:w10="urn:schemas-microsoft-com:office:word" xmlns:w="http://schemas.openxmlformats.org/wordprocessingml/2006/main" xmlns:w14="http://schemas.microsoft.com/office/word/2010/wordml" xmlns:w15="http://schemas.microsoft.com/office/word/2012/wordml" xmlns:w16cex="http://schemas.microsoft.com/office/word/2018/wordml/cex" xmlns:w16cid="http://schemas.microsoft.com/office/word/2016/wordml/cid" xmlns:w16="http://schemas.microsoft.com/office/word/2018/wordml" xmlns:w16sdtdh="http://schemas.microsoft.com/office/word/2020/wordml/sdtdatahash" xmlns:w16se="http://schemas.microsoft.com/office/word/2015/wordml/symex" xmlns:wpg="http://schemas.microsoft.com/office/word/2010/wordprocessingGroup" xmlns:wpi="http://schemas.microsoft.com/office/word/2010/wordprocessingInk" xmlns:wne="http://schemas.microsoft.com/office/word/2006/wordml" xmlns:wps="http://schemas.microsoft.com/office/word/2010/wordprocessingShape" mc:Ignorable="w14 w15 w16se w16cid w16 w16cex w16sdtdh wp14">
+  <w:p>
+    <w:pPr>
+      <w:pStyle w:val="Footer"/>
+    </w:pPr>
+  </w:p>
+</w:ftr>
+</file>
+
+<file path=word/footer2.xml><?xml version="1.0" encoding="utf-8"?>
+<w:ftr xmlns:wpc="http://schemas.microsoft.com/office/word/2010/wordprocessingCanvas" xmlns:cx="http://schemas.microsoft.com/office/drawing/2014/chartex" xmlns:cx1="http://schemas.microsoft.com/office/drawing/2015/9/8/chartex" xmlns:cx2="http://schemas.microsoft.com/office/drawing/2015/10/21/chartex" xmlns:cx3="http://schemas.microsoft.com/office/drawing/2016/5/9/chartex" xmlns:cx4="http://schemas.microsoft.com/office/drawing/2016/5/10/chartex" xmlns:cx5="http://schemas.microsoft.com/office/drawing/2016/5/11/chartex" xmlns:cx6="http://schemas.microsoft.com/office/drawing/2016/5/12/chartex" xmlns:cx7="http://schemas.microsoft.com/office/drawing/2016/5/13/chartex" xmlns:cx8="http://schemas.microsoft.com/office/drawing/2016/5/14/chartex" xmlns:mc="http://schemas.openxmlformats.org/markup-compatibility/2006" xmlns:aink="http://schemas.microsoft.com/office/drawing/2016/ink" xmlns:am3d="http://schemas.microsoft.com/office/drawing/2017/model3d" xmlns:o="urn:schemas-microsoft-com:office:office" xmlns:oel="http://schemas.microsoft.com/office/2019/extlst" xmlns:r="http://schemas.openxmlformats.org/officeDocument/2006/relationships" xmlns:m="http://schemas.openxmlformats.org/officeDocument/2006/math" xmlns:v="urn:schemas-microsoft-com:vml" xmlns:wp14="http://schemas.microsoft.com/office/word/2010/wordprocessingDrawing" xmlns:wp="http://schemas.openxmlformats.org/drawingml/2006/wordprocessingDrawing" xmlns:w10="urn:schemas-microsoft-com:office:word" xmlns:w="http://schemas.openxmlformats.org/wordprocessingml/2006/main" xmlns:w14="http://schemas.microsoft.com/office/word/2010/wordml" xmlns:w15="http://schemas.microsoft.com/office/word/2012/wordml" xmlns:w16cex="http://schemas.microsoft.com/office/word/2018/wordml/cex" xmlns:w16cid="http://schemas.microsoft.com/office/word/2016/wordml/cid" xmlns:w16="http://schemas.microsoft.com/office/word/2018/wordml" xmlns:w16sdtdh="http://schemas.microsoft.com/office/word/2020/wordml/sdtdatahash" xmlns:w16se="http://schemas.microsoft.com/office/word/2015/wordml/symex" xmlns:wpg="http://schemas.microsoft.com/office/word/2010/wordprocessingGroup" xmlns:wpi="http://schemas.microsoft.com/office/word/2010/wordprocessingInk" xmlns:wne="http://schemas.microsoft.com/office/word/2006/wordml" xmlns:wps="http://schemas.microsoft.com/office/word/2010/wordprocessingShape" mc:Ignorable="w14 w15 w16se w16cid w16 w16cex w16sdtdh wp14">
   <w:sdt>
     <w:sdtPr>
       <w:id w:val="1545951863"/>
@@ -3180,8 +3029,18 @@
 </w:ftr>
 </file>
 
+<file path=word/footer3.xml><?xml version="1.0" encoding="utf-8"?>
+<w:ftr xmlns:wpc="http://schemas.microsoft.com/office/word/2010/wordprocessingCanvas" xmlns:cx="http://schemas.microsoft.com/office/drawing/2014/chartex" xmlns:cx1="http://schemas.microsoft.com/office/drawing/2015/9/8/chartex" xmlns:cx2="http://schemas.microsoft.com/office/drawing/2015/10/21/chartex" xmlns:cx3="http://schemas.microsoft.com/office/drawing/2016/5/9/chartex" xmlns:cx4="http://schemas.microsoft.com/office/drawing/2016/5/10/chartex" xmlns:cx5="http://schemas.microsoft.com/office/drawing/2016/5/11/chartex" xmlns:cx6="http://schemas.microsoft.com/office/drawing/2016/5/12/chartex" xmlns:cx7="http://schemas.microsoft.com/office/drawing/2016/5/13/chartex" xmlns:cx8="http://schemas.microsoft.com/office/drawing/2016/5/14/chartex" xmlns:mc="http://schemas.openxmlformats.org/markup-compatibility/2006" xmlns:aink="http://schemas.microsoft.com/office/drawing/2016/ink" xmlns:am3d="http://schemas.microsoft.com/office/drawing/2017/model3d" xmlns:o="urn:schemas-microsoft-com:office:office" xmlns:oel="http://schemas.microsoft.com/office/2019/extlst" xmlns:r="http://schemas.openxmlformats.org/officeDocument/2006/relationships" xmlns:m="http://schemas.openxmlformats.org/officeDocument/2006/math" xmlns:v="urn:schemas-microsoft-com:vml" xmlns:wp14="http://schemas.microsoft.com/office/word/2010/wordprocessingDrawing" xmlns:wp="http://schemas.openxmlformats.org/drawingml/2006/wordprocessingDrawing" xmlns:w10="urn:schemas-microsoft-com:office:word" xmlns:w="http://schemas.openxmlformats.org/wordprocessingml/2006/main" xmlns:w14="http://schemas.microsoft.com/office/word/2010/wordml" xmlns:w15="http://schemas.microsoft.com/office/word/2012/wordml" xmlns:w16cex="http://schemas.microsoft.com/office/word/2018/wordml/cex" xmlns:w16cid="http://schemas.microsoft.com/office/word/2016/wordml/cid" xmlns:w16="http://schemas.microsoft.com/office/word/2018/wordml" xmlns:w16sdtdh="http://schemas.microsoft.com/office/word/2020/wordml/sdtdatahash" xmlns:w16se="http://schemas.microsoft.com/office/word/2015/wordml/symex" xmlns:wpg="http://schemas.microsoft.com/office/word/2010/wordprocessingGroup" xmlns:wpi="http://schemas.microsoft.com/office/word/2010/wordprocessingInk" xmlns:wne="http://schemas.microsoft.com/office/word/2006/wordml" xmlns:wps="http://schemas.microsoft.com/office/word/2010/wordprocessingShape" mc:Ignorable="w14 w15 w16se w16cid w16 w16cex w16sdtdh wp14">
+  <w:p>
+    <w:pPr>
+      <w:pStyle w:val="Footer"/>
+    </w:pPr>
+  </w:p>
+</w:ftr>
+</file>
+
 <file path=word/footnotes.xml><?xml version="1.0" encoding="utf-8"?>
-<w:footnotes xmlns:wpc="http://schemas.microsoft.com/office/word/2010/wordprocessingCanvas" xmlns:cx="http://schemas.microsoft.com/office/drawing/2014/chartex" xmlns:cx1="http://schemas.microsoft.com/office/drawing/2015/9/8/chartex" xmlns:cx2="http://schemas.microsoft.com/office/drawing/2015/10/21/chartex" xmlns:cx3="http://schemas.microsoft.com/office/drawing/2016/5/9/chartex" xmlns:cx4="http://schemas.microsoft.com/office/drawing/2016/5/10/chartex" xmlns:cx5="http://schemas.microsoft.com/office/drawing/2016/5/11/chartex" xmlns:cx6="http://schemas.microsoft.com/office/drawing/2016/5/12/chartex" xmlns:cx7="http://schemas.microsoft.com/office/drawing/2016/5/13/chartex" xmlns:cx8="http://schemas.microsoft.com/office/drawing/2016/5/14/chartex" xmlns:mc="http://schemas.openxmlformats.org/markup-compatibility/2006" xmlns:aink="http://schemas.microsoft.com/office/drawing/2016/ink" xmlns:am3d="http://schemas.microsoft.com/office/drawing/2017/model3d" xmlns:o="urn:schemas-microsoft-com:office:office" xmlns:r="http://schemas.openxmlformats.org/officeDocument/2006/relationships" xmlns:m="http://schemas.openxmlformats.org/officeDocument/2006/math" xmlns:v="urn:schemas-microsoft-com:vml" xmlns:wp14="http://schemas.microsoft.com/office/word/2010/wordprocessingDrawing" xmlns:wp="http://schemas.openxmlformats.org/drawingml/2006/wordprocessingDrawing" xmlns:w10="urn:schemas-microsoft-com:office:word" xmlns:w="http://schemas.openxmlformats.org/wordprocessingml/2006/main" xmlns:w14="http://schemas.microsoft.com/office/word/2010/wordml" xmlns:w15="http://schemas.microsoft.com/office/word/2012/wordml" xmlns:w16cex="http://schemas.microsoft.com/office/word/2018/wordml/cex" xmlns:w16cid="http://schemas.microsoft.com/office/word/2016/wordml/cid" xmlns:w16="http://schemas.microsoft.com/office/word/2018/wordml" xmlns:w16sdtdh="http://schemas.microsoft.com/office/word/2020/wordml/sdtdatahash" xmlns:w16se="http://schemas.microsoft.com/office/word/2015/wordml/symex" xmlns:wpg="http://schemas.microsoft.com/office/word/2010/wordprocessingGroup" xmlns:wpi="http://schemas.microsoft.com/office/word/2010/wordprocessingInk" xmlns:wne="http://schemas.microsoft.com/office/word/2006/wordml" xmlns:wps="http://schemas.microsoft.com/office/word/2010/wordprocessingShape" mc:Ignorable="w14 w15 w16se w16cid w16 w16cex w16sdtdh wp14">
+<w:footnotes xmlns:wpc="http://schemas.microsoft.com/office/word/2010/wordprocessingCanvas" xmlns:cx="http://schemas.microsoft.com/office/drawing/2014/chartex" xmlns:cx1="http://schemas.microsoft.com/office/drawing/2015/9/8/chartex" xmlns:cx2="http://schemas.microsoft.com/office/drawing/2015/10/21/chartex" xmlns:cx3="http://schemas.microsoft.com/office/drawing/2016/5/9/chartex" xmlns:cx4="http://schemas.microsoft.com/office/drawing/2016/5/10/chartex" xmlns:cx5="http://schemas.microsoft.com/office/drawing/2016/5/11/chartex" xmlns:cx6="http://schemas.microsoft.com/office/drawing/2016/5/12/chartex" xmlns:cx7="http://schemas.microsoft.com/office/drawing/2016/5/13/chartex" xmlns:cx8="http://schemas.microsoft.com/office/drawing/2016/5/14/chartex" xmlns:mc="http://schemas.openxmlformats.org/markup-compatibility/2006" xmlns:aink="http://schemas.microsoft.com/office/drawing/2016/ink" xmlns:am3d="http://schemas.microsoft.com/office/drawing/2017/model3d" xmlns:o="urn:schemas-microsoft-com:office:office" xmlns:oel="http://schemas.microsoft.com/office/2019/extlst" xmlns:r="http://schemas.openxmlformats.org/officeDocument/2006/relationships" xmlns:m="http://schemas.openxmlformats.org/officeDocument/2006/math" xmlns:v="urn:schemas-microsoft-com:vml" xmlns:wp14="http://schemas.microsoft.com/office/word/2010/wordprocessingDrawing" xmlns:wp="http://schemas.openxmlformats.org/drawingml/2006/wordprocessingDrawing" xmlns:w10="urn:schemas-microsoft-com:office:word" xmlns:w="http://schemas.openxmlformats.org/wordprocessingml/2006/main" xmlns:w14="http://schemas.microsoft.com/office/word/2010/wordml" xmlns:w15="http://schemas.microsoft.com/office/word/2012/wordml" xmlns:w16cex="http://schemas.microsoft.com/office/word/2018/wordml/cex" xmlns:w16cid="http://schemas.microsoft.com/office/word/2016/wordml/cid" xmlns:w16="http://schemas.microsoft.com/office/word/2018/wordml" xmlns:w16sdtdh="http://schemas.microsoft.com/office/word/2020/wordml/sdtdatahash" xmlns:w16se="http://schemas.microsoft.com/office/word/2015/wordml/symex" xmlns:wpg="http://schemas.microsoft.com/office/word/2010/wordprocessingGroup" xmlns:wpi="http://schemas.microsoft.com/office/word/2010/wordprocessingInk" xmlns:wne="http://schemas.microsoft.com/office/word/2006/wordml" xmlns:wps="http://schemas.microsoft.com/office/word/2010/wordprocessingShape" mc:Ignorable="w14 w15 w16se w16cid w16 w16cex w16sdtdh wp14">
   <w:footnote w:type="separator" w:id="-1">
     <w:p>
       <w:r>
@@ -3200,7 +3059,17 @@
 </file>
 
 <file path=word/header1.xml><?xml version="1.0" encoding="utf-8"?>
-<w:hdr xmlns:wpc="http://schemas.microsoft.com/office/word/2010/wordprocessingCanvas" xmlns:cx="http://schemas.microsoft.com/office/drawing/2014/chartex" xmlns:cx1="http://schemas.microsoft.com/office/drawing/2015/9/8/chartex" xmlns:cx2="http://schemas.microsoft.com/office/drawing/2015/10/21/chartex" xmlns:cx3="http://schemas.microsoft.com/office/drawing/2016/5/9/chartex" xmlns:cx4="http://schemas.microsoft.com/office/drawing/2016/5/10/chartex" xmlns:cx5="http://schemas.microsoft.com/office/drawing/2016/5/11/chartex" xmlns:cx6="http://schemas.microsoft.com/office/drawing/2016/5/12/chartex" xmlns:cx7="http://schemas.microsoft.com/office/drawing/2016/5/13/chartex" xmlns:cx8="http://schemas.microsoft.com/office/drawing/2016/5/14/chartex" xmlns:mc="http://schemas.openxmlformats.org/markup-compatibility/2006" xmlns:aink="http://schemas.microsoft.com/office/drawing/2016/ink" xmlns:am3d="http://schemas.microsoft.com/office/drawing/2017/model3d" xmlns:o="urn:schemas-microsoft-com:office:office" xmlns:r="http://schemas.openxmlformats.org/officeDocument/2006/relationships" xmlns:m="http://schemas.openxmlformats.org/officeDocument/2006/math" xmlns:v="urn:schemas-microsoft-com:vml" xmlns:wp14="http://schemas.microsoft.com/office/word/2010/wordprocessingDrawing" xmlns:wp="http://schemas.openxmlformats.org/drawingml/2006/wordprocessingDrawing" xmlns:w10="urn:schemas-microsoft-com:office:word" xmlns:w="http://schemas.openxmlformats.org/wordprocessingml/2006/main" xmlns:w14="http://schemas.microsoft.com/office/word/2010/wordml" xmlns:w15="http://schemas.microsoft.com/office/word/2012/wordml" xmlns:w16cex="http://schemas.microsoft.com/office/word/2018/wordml/cex" xmlns:w16cid="http://schemas.microsoft.com/office/word/2016/wordml/cid" xmlns:w16="http://schemas.microsoft.com/office/word/2018/wordml" xmlns:w16sdtdh="http://schemas.microsoft.com/office/word/2020/wordml/sdtdatahash" xmlns:w16se="http://schemas.microsoft.com/office/word/2015/wordml/symex" xmlns:wpg="http://schemas.microsoft.com/office/word/2010/wordprocessingGroup" xmlns:wpi="http://schemas.microsoft.com/office/word/2010/wordprocessingInk" xmlns:wne="http://schemas.microsoft.com/office/word/2006/wordml" xmlns:wps="http://schemas.microsoft.com/office/word/2010/wordprocessingShape" mc:Ignorable="w14 w15 w16se w16cid w16 w16cex w16sdtdh wp14">
+<w:hdr xmlns:wpc="http://schemas.microsoft.com/office/word/2010/wordprocessingCanvas" xmlns:cx="http://schemas.microsoft.com/office/drawing/2014/chartex" xmlns:cx1="http://schemas.microsoft.com/office/drawing/2015/9/8/chartex" xmlns:cx2="http://schemas.microsoft.com/office/drawing/2015/10/21/chartex" xmlns:cx3="http://schemas.microsoft.com/office/drawing/2016/5/9/chartex" xmlns:cx4="http://schemas.microsoft.com/office/drawing/2016/5/10/chartex" xmlns:cx5="http://schemas.microsoft.com/office/drawing/2016/5/11/chartex" xmlns:cx6="http://schemas.microsoft.com/office/drawing/2016/5/12/chartex" xmlns:cx7="http://schemas.microsoft.com/office/drawing/2016/5/13/chartex" xmlns:cx8="http://schemas.microsoft.com/office/drawing/2016/5/14/chartex" xmlns:mc="http://schemas.openxmlformats.org/markup-compatibility/2006" xmlns:aink="http://schemas.microsoft.com/office/drawing/2016/ink" xmlns:am3d="http://schemas.microsoft.com/office/drawing/2017/model3d" xmlns:o="urn:schemas-microsoft-com:office:office" xmlns:oel="http://schemas.microsoft.com/office/2019/extlst" xmlns:r="http://schemas.openxmlformats.org/officeDocument/2006/relationships" xmlns:m="http://schemas.openxmlformats.org/officeDocument/2006/math" xmlns:v="urn:schemas-microsoft-com:vml" xmlns:wp14="http://schemas.microsoft.com/office/word/2010/wordprocessingDrawing" xmlns:wp="http://schemas.openxmlformats.org/drawingml/2006/wordprocessingDrawing" xmlns:w10="urn:schemas-microsoft-com:office:word" xmlns:w="http://schemas.openxmlformats.org/wordprocessingml/2006/main" xmlns:w14="http://schemas.microsoft.com/office/word/2010/wordml" xmlns:w15="http://schemas.microsoft.com/office/word/2012/wordml" xmlns:w16cex="http://schemas.microsoft.com/office/word/2018/wordml/cex" xmlns:w16cid="http://schemas.microsoft.com/office/word/2016/wordml/cid" xmlns:w16="http://schemas.microsoft.com/office/word/2018/wordml" xmlns:w16sdtdh="http://schemas.microsoft.com/office/word/2020/wordml/sdtdatahash" xmlns:w16se="http://schemas.microsoft.com/office/word/2015/wordml/symex" xmlns:wpg="http://schemas.microsoft.com/office/word/2010/wordprocessingGroup" xmlns:wpi="http://schemas.microsoft.com/office/word/2010/wordprocessingInk" xmlns:wne="http://schemas.microsoft.com/office/word/2006/wordml" xmlns:wps="http://schemas.microsoft.com/office/word/2010/wordprocessingShape" mc:Ignorable="w14 w15 w16se w16cid w16 w16cex w16sdtdh wp14">
+  <w:p>
+    <w:pPr>
+      <w:pStyle w:val="Header"/>
+    </w:pPr>
+  </w:p>
+</w:hdr>
+</file>
+
+<file path=word/header2.xml><?xml version="1.0" encoding="utf-8"?>
+<w:hdr xmlns:wpc="http://schemas.microsoft.com/office/word/2010/wordprocessingCanvas" xmlns:cx="http://schemas.microsoft.com/office/drawing/2014/chartex" xmlns:cx1="http://schemas.microsoft.com/office/drawing/2015/9/8/chartex" xmlns:cx2="http://schemas.microsoft.com/office/drawing/2015/10/21/chartex" xmlns:cx3="http://schemas.microsoft.com/office/drawing/2016/5/9/chartex" xmlns:cx4="http://schemas.microsoft.com/office/drawing/2016/5/10/chartex" xmlns:cx5="http://schemas.microsoft.com/office/drawing/2016/5/11/chartex" xmlns:cx6="http://schemas.microsoft.com/office/drawing/2016/5/12/chartex" xmlns:cx7="http://schemas.microsoft.com/office/drawing/2016/5/13/chartex" xmlns:cx8="http://schemas.microsoft.com/office/drawing/2016/5/14/chartex" xmlns:mc="http://schemas.openxmlformats.org/markup-compatibility/2006" xmlns:aink="http://schemas.microsoft.com/office/drawing/2016/ink" xmlns:am3d="http://schemas.microsoft.com/office/drawing/2017/model3d" xmlns:o="urn:schemas-microsoft-com:office:office" xmlns:oel="http://schemas.microsoft.com/office/2019/extlst" xmlns:r="http://schemas.openxmlformats.org/officeDocument/2006/relationships" xmlns:m="http://schemas.openxmlformats.org/officeDocument/2006/math" xmlns:v="urn:schemas-microsoft-com:vml" xmlns:wp14="http://schemas.microsoft.com/office/word/2010/wordprocessingDrawing" xmlns:wp="http://schemas.openxmlformats.org/drawingml/2006/wordprocessingDrawing" xmlns:w10="urn:schemas-microsoft-com:office:word" xmlns:w="http://schemas.openxmlformats.org/wordprocessingml/2006/main" xmlns:w14="http://schemas.microsoft.com/office/word/2010/wordml" xmlns:w15="http://schemas.microsoft.com/office/word/2012/wordml" xmlns:w16cex="http://schemas.microsoft.com/office/word/2018/wordml/cex" xmlns:w16cid="http://schemas.microsoft.com/office/word/2016/wordml/cid" xmlns:w16="http://schemas.microsoft.com/office/word/2018/wordml" xmlns:w16sdtdh="http://schemas.microsoft.com/office/word/2020/wordml/sdtdatahash" xmlns:w16se="http://schemas.microsoft.com/office/word/2015/wordml/symex" xmlns:wpg="http://schemas.microsoft.com/office/word/2010/wordprocessingGroup" xmlns:wpi="http://schemas.microsoft.com/office/word/2010/wordprocessingInk" xmlns:wne="http://schemas.microsoft.com/office/word/2006/wordml" xmlns:wps="http://schemas.microsoft.com/office/word/2010/wordprocessingShape" mc:Ignorable="w14 w15 w16se w16cid w16 w16cex w16sdtdh wp14">
   <w:p>
     <w:pPr>
       <w:pStyle w:val="Header"/>
@@ -3216,16 +3085,16 @@
       <mc:AlternateContent>
         <mc:Choice Requires="wps">
           <w:drawing>
-            <wp:anchor distT="0" distB="0" distL="114300" distR="114300" simplePos="0" relativeHeight="251661824" behindDoc="0" locked="0" layoutInCell="1" allowOverlap="1" wp14:anchorId="21FD6A98" wp14:editId="11EF0431">
+            <wp:anchor distT="0" distB="0" distL="114300" distR="114300" simplePos="0" relativeHeight="251661824" behindDoc="0" locked="0" layoutInCell="1" allowOverlap="1" wp14:anchorId="21FD6A98" wp14:editId="69EA1344">
               <wp:simplePos x="0" y="0"/>
               <wp:positionH relativeFrom="column">
-                <wp:posOffset>8908011</wp:posOffset>
+                <wp:posOffset>8907780</wp:posOffset>
               </wp:positionH>
               <wp:positionV relativeFrom="paragraph">
-                <wp:posOffset>128154</wp:posOffset>
+                <wp:posOffset>0</wp:posOffset>
               </wp:positionV>
-              <wp:extent cx="2278380" cy="852054"/>
-              <wp:effectExtent l="0" t="0" r="26670" b="24765"/>
+              <wp:extent cx="2278380" cy="1348740"/>
+              <wp:effectExtent l="0" t="0" r="26670" b="22860"/>
               <wp:wrapNone/>
               <wp:docPr id="8" name="Rectangle 8"/>
               <wp:cNvGraphicFramePr/>
@@ -3236,7 +3105,7 @@
                     <wps:spPr>
                       <a:xfrm>
                         <a:off x="0" y="0"/>
-                        <a:ext cx="2278380" cy="852054"/>
+                        <a:ext cx="2278380" cy="1348740"/>
                       </a:xfrm>
                       <a:prstGeom prst="rect">
                         <a:avLst/>
@@ -3265,90 +3134,259 @@
                       <w:txbxContent>
                         <w:p>
                           <w:pPr>
-                            <w:jc w:val="right"/>
+                            <w:autoSpaceDE w:val="0"/>
+                            <w:autoSpaceDN w:val="0"/>
+                            <w:adjustRightInd w:val="0"/>
                             <w:rPr>
-                              <w:rFonts w:ascii="Tahoma" w:hAnsi="Tahoma" w:cs="Tahoma"/>
-                              <w:sz w:val="16"/>
-                              <w:szCs w:val="16"/>
+                              <w:rFonts w:ascii="Arial" w:hAnsi="Arial" w:cs="Arial"/>
+                              <w:color w:val="525A5D"/>
+                              <w:sz w:val="18"/>
+                              <w:szCs w:val="18"/>
                             </w:rPr>
                           </w:pPr>
                           <w:proofErr w:type="spellStart"/>
                           <w:r>
                             <w:rPr>
-                              <w:rFonts w:ascii="Tahoma" w:hAnsi="Tahoma" w:cs="Tahoma"/>
-                              <w:sz w:val="16"/>
-                              <w:szCs w:val="16"/>
+                              <w:rFonts w:ascii="Arial" w:hAnsi="Arial" w:cs="Arial"/>
+                              <w:color w:val="525A5D"/>
+                              <w:sz w:val="18"/>
+                              <w:szCs w:val="18"/>
                             </w:rPr>
-                            <w:t>Mouchak</w:t>
+                            <w:t>Akbarpur</w:t>
                           </w:r>
                           <w:proofErr w:type="spellEnd"/>
                           <w:r>
                             <w:rPr>
-                              <w:rFonts w:ascii="Tahoma" w:hAnsi="Tahoma" w:cs="Tahoma"/>
-                              <w:sz w:val="16"/>
-                              <w:szCs w:val="16"/>
+                              <w:rFonts w:ascii="Arial" w:hAnsi="Arial" w:cs="Arial"/>
+                              <w:color w:val="525A5D"/>
+                              <w:sz w:val="18"/>
+                              <w:szCs w:val="18"/>
                             </w:rPr>
-                            <w:t xml:space="preserve"> Knit Composite Ltd.</w:t>
-                          </w:r>
-                          <w:r>
-                            <w:rPr>
-                              <w:rFonts w:ascii="Tahoma" w:hAnsi="Tahoma" w:cs="Tahoma"/>
-                              <w:sz w:val="16"/>
-                              <w:szCs w:val="16"/>
-                            </w:rPr>
-                            <w:t xml:space="preserve">, P.S: </w:t>
+                            <w:t xml:space="preserve"> Channa, Ludhiana-</w:t>
                           </w:r>
                           <w:proofErr w:type="spellStart"/>
                           <w:r>
                             <w:rPr>
-                              <w:rFonts w:ascii="Tahoma" w:hAnsi="Tahoma" w:cs="Tahoma"/>
-                              <w:sz w:val="16"/>
-                              <w:szCs w:val="16"/>
+                              <w:rFonts w:ascii="Arial" w:hAnsi="Arial" w:cs="Arial"/>
+                              <w:color w:val="525A5D"/>
+                              <w:sz w:val="18"/>
+                              <w:szCs w:val="18"/>
                             </w:rPr>
-                            <w:t>Kaliakair</w:t>
+                            <w:t>Malerkotla</w:t>
                           </w:r>
                           <w:proofErr w:type="spellEnd"/>
                           <w:r>
                             <w:rPr>
-                              <w:rFonts w:ascii="Tahoma" w:hAnsi="Tahoma" w:cs="Tahoma"/>
-                              <w:sz w:val="16"/>
-                              <w:szCs w:val="16"/>
+                              <w:rFonts w:ascii="Arial" w:hAnsi="Arial" w:cs="Arial"/>
+                              <w:color w:val="525A5D"/>
+                              <w:sz w:val="18"/>
+                              <w:szCs w:val="18"/>
                             </w:rPr>
-                            <w:t xml:space="preserve"> District: Gazipur-</w:t>
+                            <w:t xml:space="preserve"> Road, </w:t>
                           </w:r>
-                          <w:proofErr w:type="gramStart"/>
+                          <w:proofErr w:type="spellStart"/>
                           <w:r>
                             <w:rPr>
-                              <w:rFonts w:ascii="Tahoma" w:hAnsi="Tahoma" w:cs="Tahoma"/>
-                              <w:sz w:val="16"/>
-                              <w:szCs w:val="16"/>
+                              <w:rFonts w:ascii="Arial" w:hAnsi="Arial" w:cs="Arial"/>
+                              <w:color w:val="525A5D"/>
+                              <w:sz w:val="18"/>
+                              <w:szCs w:val="18"/>
                             </w:rPr>
-                            <w:t>1751,</w:t>
+                            <w:t>Ahmedgarh</w:t>
+                          </w:r>
+                          <w:proofErr w:type="spellEnd"/>
+                          <w:r>
+                            <w:rPr>
+                              <w:rFonts w:ascii="Arial" w:hAnsi="Arial" w:cs="Arial"/>
+                              <w:color w:val="525A5D"/>
+                              <w:sz w:val="18"/>
+                              <w:szCs w:val="18"/>
+                            </w:rPr>
+                            <w:t xml:space="preserve"> - 148021 District, Sangrur</w:t>
                           </w:r>
                           <w:r>
                             <w:rPr>
-                              <w:rFonts w:ascii="Tahoma" w:hAnsi="Tahoma" w:cs="Tahoma"/>
-                              <w:sz w:val="16"/>
-                              <w:szCs w:val="16"/>
+                              <w:rFonts w:ascii="Arial" w:hAnsi="Arial" w:cs="Arial"/>
+                              <w:color w:val="73797F"/>
+                              <w:sz w:val="18"/>
+                              <w:szCs w:val="18"/>
                             </w:rPr>
-                            <w:t>Bangladesh</w:t>
-                          </w:r>
-                          <w:proofErr w:type="gramEnd"/>
-                          <w:r>
-                            <w:rPr>
-                              <w:rFonts w:ascii="Tahoma" w:hAnsi="Tahoma" w:cs="Tahoma"/>
-                              <w:sz w:val="16"/>
-                              <w:szCs w:val="16"/>
-                            </w:rPr>
-                            <w:t>.</w:t>
+                            <w:t xml:space="preserve">, </w:t>
                           </w:r>
                           <w:r>
                             <w:rPr>
-                              <w:rFonts w:ascii="Tahoma" w:hAnsi="Tahoma" w:cs="Tahoma"/>
-                              <w:sz w:val="16"/>
-                              <w:szCs w:val="16"/>
+                              <w:rFonts w:ascii="Arial" w:hAnsi="Arial" w:cs="Arial"/>
+                              <w:color w:val="525A5D"/>
+                              <w:sz w:val="18"/>
+                              <w:szCs w:val="18"/>
                             </w:rPr>
-                            <w:t xml:space="preserve">   </w:t>
+                            <w:t>Punjab (Ind</w:t>
+                          </w:r>
+                          <w:r>
+                            <w:rPr>
+                              <w:rFonts w:ascii="Arial" w:hAnsi="Arial" w:cs="Arial"/>
+                              <w:color w:val="73797F"/>
+                              <w:sz w:val="18"/>
+                              <w:szCs w:val="18"/>
+                            </w:rPr>
+                            <w:t>i</w:t>
+                          </w:r>
+                          <w:r>
+                            <w:rPr>
+                              <w:rFonts w:ascii="Arial" w:hAnsi="Arial" w:cs="Arial"/>
+                              <w:color w:val="525A5D"/>
+                              <w:sz w:val="18"/>
+                              <w:szCs w:val="18"/>
+                            </w:rPr>
+                            <w:t>a)</w:t>
+                          </w:r>
+                        </w:p>
+                        <w:p>
+                          <w:pPr>
+                            <w:autoSpaceDE w:val="0"/>
+                            <w:autoSpaceDN w:val="0"/>
+                            <w:adjustRightInd w:val="0"/>
+                            <w:rPr>
+                              <w:rFonts w:ascii="Arial" w:hAnsi="Arial" w:cs="Arial"/>
+                              <w:color w:val="525A5D"/>
+                              <w:sz w:val="18"/>
+                              <w:szCs w:val="18"/>
+                            </w:rPr>
+                          </w:pPr>
+                          <w:r>
+                            <w:rPr>
+                              <w:rFonts w:ascii="Arial" w:hAnsi="Arial" w:cs="Arial"/>
+                              <w:color w:val="525A5D"/>
+                              <w:sz w:val="18"/>
+                              <w:szCs w:val="18"/>
+                            </w:rPr>
+                            <w:t xml:space="preserve">e-mail: info@cedaartextile.com </w:t>
+                          </w:r>
+                        </w:p>
+                        <w:p>
+                          <w:pPr>
+                            <w:autoSpaceDE w:val="0"/>
+                            <w:autoSpaceDN w:val="0"/>
+                            <w:adjustRightInd w:val="0"/>
+                            <w:rPr>
+                              <w:rFonts w:ascii="Arial" w:hAnsi="Arial" w:cs="Arial"/>
+                              <w:color w:val="525A5D"/>
+                              <w:sz w:val="18"/>
+                              <w:szCs w:val="18"/>
+                            </w:rPr>
+                          </w:pPr>
+                          <w:r>
+                            <w:rPr>
+                              <w:rFonts w:ascii="Arial" w:hAnsi="Arial" w:cs="Arial"/>
+                              <w:color w:val="525A5D"/>
+                              <w:sz w:val="18"/>
+                              <w:szCs w:val="18"/>
+                            </w:rPr>
+                            <w:t xml:space="preserve">website: </w:t>
+                          </w:r>
+                          <w:hyperlink r:id="rId1" w:history="1">
+                            <w:r>
+                              <w:rPr>
+                                <w:rStyle w:val="Hyperlink"/>
+                                <w:rFonts w:ascii="Arial" w:hAnsi="Arial" w:cs="Arial"/>
+                                <w:sz w:val="18"/>
+                                <w:szCs w:val="18"/>
+                              </w:rPr>
+                              <w:t>www.cedaartextile.com</w:t>
+                            </w:r>
+                          </w:hyperlink>
+                        </w:p>
+                        <w:p>
+                          <w:pPr>
+                            <w:autoSpaceDE w:val="0"/>
+                            <w:autoSpaceDN w:val="0"/>
+                            <w:adjustRightInd w:val="0"/>
+                            <w:rPr>
+                              <w:rFonts w:ascii="Arial" w:hAnsi="Arial" w:cs="Arial"/>
+                              <w:color w:val="525A5D"/>
+                              <w:sz w:val="18"/>
+                              <w:szCs w:val="18"/>
+                            </w:rPr>
+                          </w:pPr>
+                          <w:r>
+                            <w:rPr>
+                              <w:rFonts w:ascii="Arial" w:hAnsi="Arial" w:cs="Arial"/>
+                              <w:color w:val="525A5D"/>
+                              <w:sz w:val="18"/>
+                              <w:szCs w:val="18"/>
+                            </w:rPr>
+                            <w:t>Ph</w:t>
+                          </w:r>
+                          <w:r>
+                            <w:rPr>
+                              <w:rFonts w:ascii="Arial" w:hAnsi="Arial" w:cs="Arial"/>
+                              <w:color w:val="73797F"/>
+                              <w:sz w:val="18"/>
+                              <w:szCs w:val="18"/>
+                            </w:rPr>
+                            <w:t xml:space="preserve">: </w:t>
+                          </w:r>
+                          <w:r>
+                            <w:rPr>
+                              <w:rFonts w:ascii="Arial" w:hAnsi="Arial" w:cs="Arial"/>
+                              <w:color w:val="525A5D"/>
+                              <w:sz w:val="18"/>
+                              <w:szCs w:val="18"/>
+                            </w:rPr>
+                            <w:t>+91-85588-52200</w:t>
+                          </w:r>
+                        </w:p>
+                        <w:p>
+                          <w:pPr>
+                            <w:autoSpaceDE w:val="0"/>
+                            <w:autoSpaceDN w:val="0"/>
+                            <w:adjustRightInd w:val="0"/>
+                            <w:rPr>
+                              <w:rFonts w:ascii="Arial" w:hAnsi="Arial" w:cs="Arial"/>
+                              <w:color w:val="525A5D"/>
+                              <w:sz w:val="18"/>
+                              <w:szCs w:val="18"/>
+                            </w:rPr>
+                          </w:pPr>
+                          <w:r>
+                            <w:rPr>
+                              <w:rFonts w:ascii="Arial" w:hAnsi="Arial" w:cs="Arial"/>
+                              <w:color w:val="525A5D"/>
+                              <w:sz w:val="18"/>
+                              <w:szCs w:val="18"/>
+                            </w:rPr>
+                            <w:t>CIN: U17299KA2020PTC139070</w:t>
+                          </w:r>
+                        </w:p>
+                        <w:p>
+                          <w:pPr>
+                            <w:autoSpaceDE w:val="0"/>
+                            <w:autoSpaceDN w:val="0"/>
+                            <w:adjustRightInd w:val="0"/>
+                            <w:rPr>
+                              <w:rFonts w:ascii="Arial" w:hAnsi="Arial" w:cs="Arial"/>
+                              <w:color w:val="525A5D"/>
+                              <w:sz w:val="18"/>
+                              <w:szCs w:val="18"/>
+                            </w:rPr>
+                          </w:pPr>
+                          <w:r>
+                            <w:rPr>
+                              <w:rFonts w:ascii="Arial" w:hAnsi="Arial" w:cs="Arial"/>
+                              <w:color w:val="525A5D"/>
+                              <w:sz w:val="18"/>
+                              <w:szCs w:val="18"/>
+                            </w:rPr>
+                            <w:t xml:space="preserve">GST: </w:t>
+                          </w:r>
+                          <w:r>
+                            <w:rPr>
+                              <w:rFonts w:ascii="Arial" w:hAnsi="Arial" w:cs="Arial"/>
+                              <w:color w:val="525A5D"/>
+                              <w:sz w:val="18"/>
+                              <w:szCs w:val="18"/>
+                            </w:rPr>
+                            <w:t>03AAJCC0212A1ZR</w:t>
                           </w:r>
                         </w:p>
                         <w:p>
@@ -3383,95 +3421,264 @@
         </mc:Choice>
         <mc:Fallback>
           <w:pict>
-            <v:rect w14:anchorId="21FD6A98" id="Rectangle 8" o:spid="_x0000_s1028" style="position:absolute;margin-left:701.4pt;margin-top:10.1pt;width:179.4pt;height:67.1pt;z-index:251661824;visibility:visible;mso-wrap-style:square;mso-width-percent:0;mso-height-percent:0;mso-wrap-distance-left:9pt;mso-wrap-distance-top:0;mso-wrap-distance-right:9pt;mso-wrap-distance-bottom:0;mso-position-horizontal:absolute;mso-position-horizontal-relative:text;mso-position-vertical:absolute;mso-position-vertical-relative:text;mso-width-percent:0;mso-height-percent:0;mso-width-relative:margin;mso-height-relative:margin;v-text-anchor:middle" o:gfxdata="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" fillcolor="white [3201]" strokecolor="white [3212]" strokeweight="1pt">
+            <v:rect w14:anchorId="21FD6A98" id="Rectangle 8" o:spid="_x0000_s1027" style="position:absolute;margin-left:701.4pt;margin-top:0;width:179.4pt;height:106.2pt;z-index:251661824;visibility:visible;mso-wrap-style:square;mso-width-percent:0;mso-height-percent:0;mso-wrap-distance-left:9pt;mso-wrap-distance-top:0;mso-wrap-distance-right:9pt;mso-wrap-distance-bottom:0;mso-position-horizontal:absolute;mso-position-horizontal-relative:text;mso-position-vertical:absolute;mso-position-vertical-relative:text;mso-width-percent:0;mso-height-percent:0;mso-width-relative:margin;mso-height-relative:margin;v-text-anchor:middle" o:gfxdata="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" fillcolor="white [3201]" strokecolor="white [3212]" strokeweight="1pt">
               <v:textbox>
                 <w:txbxContent>
                   <w:p>
                     <w:pPr>
-                      <w:jc w:val="right"/>
+                      <w:autoSpaceDE w:val="0"/>
+                      <w:autoSpaceDN w:val="0"/>
+                      <w:adjustRightInd w:val="0"/>
                       <w:rPr>
-                        <w:rFonts w:ascii="Tahoma" w:hAnsi="Tahoma" w:cs="Tahoma"/>
-                        <w:sz w:val="16"/>
-                        <w:szCs w:val="16"/>
+                        <w:rFonts w:ascii="Arial" w:hAnsi="Arial" w:cs="Arial"/>
+                        <w:color w:val="525A5D"/>
+                        <w:sz w:val="18"/>
+                        <w:szCs w:val="18"/>
                       </w:rPr>
                     </w:pPr>
                     <w:proofErr w:type="spellStart"/>
                     <w:r>
                       <w:rPr>
-                        <w:rFonts w:ascii="Tahoma" w:hAnsi="Tahoma" w:cs="Tahoma"/>
-                        <w:sz w:val="16"/>
-                        <w:szCs w:val="16"/>
+                        <w:rFonts w:ascii="Arial" w:hAnsi="Arial" w:cs="Arial"/>
+                        <w:color w:val="525A5D"/>
+                        <w:sz w:val="18"/>
+                        <w:szCs w:val="18"/>
                       </w:rPr>
-                      <w:t>Mouchak</w:t>
+                      <w:t>Akbarpur</w:t>
                     </w:r>
                     <w:proofErr w:type="spellEnd"/>
                     <w:r>
                       <w:rPr>
-                        <w:rFonts w:ascii="Tahoma" w:hAnsi="Tahoma" w:cs="Tahoma"/>
-                        <w:sz w:val="16"/>
-                        <w:szCs w:val="16"/>
+                        <w:rFonts w:ascii="Arial" w:hAnsi="Arial" w:cs="Arial"/>
+                        <w:color w:val="525A5D"/>
+                        <w:sz w:val="18"/>
+                        <w:szCs w:val="18"/>
                       </w:rPr>
-                      <w:t xml:space="preserve"> Knit Composite Ltd.</w:t>
-                    </w:r>
-                    <w:r>
-                      <w:rPr>
-                        <w:rFonts w:ascii="Tahoma" w:hAnsi="Tahoma" w:cs="Tahoma"/>
-                        <w:sz w:val="16"/>
-                        <w:szCs w:val="16"/>
-                      </w:rPr>
-                      <w:t xml:space="preserve">, P.S: </w:t>
+                      <w:t xml:space="preserve"> Channa, Ludhiana-</w:t>
                     </w:r>
                     <w:proofErr w:type="spellStart"/>
                     <w:r>
                       <w:rPr>
-                        <w:rFonts w:ascii="Tahoma" w:hAnsi="Tahoma" w:cs="Tahoma"/>
-                        <w:sz w:val="16"/>
-                        <w:szCs w:val="16"/>
+                        <w:rFonts w:ascii="Arial" w:hAnsi="Arial" w:cs="Arial"/>
+                        <w:color w:val="525A5D"/>
+                        <w:sz w:val="18"/>
+                        <w:szCs w:val="18"/>
                       </w:rPr>
-                      <w:t>Kaliakair</w:t>
+                      <w:t>Malerkotla</w:t>
                     </w:r>
                     <w:proofErr w:type="spellEnd"/>
                     <w:r>
                       <w:rPr>
-                        <w:rFonts w:ascii="Tahoma" w:hAnsi="Tahoma" w:cs="Tahoma"/>
-                        <w:sz w:val="16"/>
-                        <w:szCs w:val="16"/>
+                        <w:rFonts w:ascii="Arial" w:hAnsi="Arial" w:cs="Arial"/>
+                        <w:color w:val="525A5D"/>
+                        <w:sz w:val="18"/>
+                        <w:szCs w:val="18"/>
                       </w:rPr>
-                      <w:t xml:space="preserve"> District: Gazipur-</w:t>
+                      <w:t xml:space="preserve"> Road, </w:t>
                     </w:r>
-                    <w:proofErr w:type="gramStart"/>
+                    <w:proofErr w:type="spellStart"/>
                     <w:r>
                       <w:rPr>
-                        <w:rFonts w:ascii="Tahoma" w:hAnsi="Tahoma" w:cs="Tahoma"/>
-                        <w:sz w:val="16"/>
-                        <w:szCs w:val="16"/>
+                        <w:rFonts w:ascii="Arial" w:hAnsi="Arial" w:cs="Arial"/>
+                        <w:color w:val="525A5D"/>
+                        <w:sz w:val="18"/>
+                        <w:szCs w:val="18"/>
                       </w:rPr>
-                      <w:t>1751,</w:t>
+                      <w:t>Ahmedgarh</w:t>
+                    </w:r>
+                    <w:proofErr w:type="spellEnd"/>
+                    <w:r>
+                      <w:rPr>
+                        <w:rFonts w:ascii="Arial" w:hAnsi="Arial" w:cs="Arial"/>
+                        <w:color w:val="525A5D"/>
+                        <w:sz w:val="18"/>
+                        <w:szCs w:val="18"/>
+                      </w:rPr>
+                      <w:t xml:space="preserve"> - 148021 District, Sangrur</w:t>
                     </w:r>
                     <w:r>
                       <w:rPr>
-                        <w:rFonts w:ascii="Tahoma" w:hAnsi="Tahoma" w:cs="Tahoma"/>
-                        <w:sz w:val="16"/>
-                        <w:szCs w:val="16"/>
+                        <w:rFonts w:ascii="Arial" w:hAnsi="Arial" w:cs="Arial"/>
+                        <w:color w:val="73797F"/>
+                        <w:sz w:val="18"/>
+                        <w:szCs w:val="18"/>
                       </w:rPr>
-                      <w:t>Bangladesh</w:t>
-                    </w:r>
-                    <w:proofErr w:type="gramEnd"/>
-                    <w:r>
-                      <w:rPr>
-                        <w:rFonts w:ascii="Tahoma" w:hAnsi="Tahoma" w:cs="Tahoma"/>
-                        <w:sz w:val="16"/>
-                        <w:szCs w:val="16"/>
-                      </w:rPr>
-                      <w:t>.</w:t>
+                      <w:t xml:space="preserve">, </w:t>
                     </w:r>
                     <w:r>
                       <w:rPr>
-                        <w:rFonts w:ascii="Tahoma" w:hAnsi="Tahoma" w:cs="Tahoma"/>
-                        <w:sz w:val="16"/>
-                        <w:szCs w:val="16"/>
+                        <w:rFonts w:ascii="Arial" w:hAnsi="Arial" w:cs="Arial"/>
+                        <w:color w:val="525A5D"/>
+                        <w:sz w:val="18"/>
+                        <w:szCs w:val="18"/>
                       </w:rPr>
-                      <w:t xml:space="preserve">   </w:t>
+                      <w:t>Punjab (Ind</w:t>
+                    </w:r>
+                    <w:r>
+                      <w:rPr>
+                        <w:rFonts w:ascii="Arial" w:hAnsi="Arial" w:cs="Arial"/>
+                        <w:color w:val="73797F"/>
+                        <w:sz w:val="18"/>
+                        <w:szCs w:val="18"/>
+                      </w:rPr>
+                      <w:t>i</w:t>
+                    </w:r>
+                    <w:r>
+                      <w:rPr>
+                        <w:rFonts w:ascii="Arial" w:hAnsi="Arial" w:cs="Arial"/>
+                        <w:color w:val="525A5D"/>
+                        <w:sz w:val="18"/>
+                        <w:szCs w:val="18"/>
+                      </w:rPr>
+                      <w:t>a)</w:t>
+                    </w:r>
+                  </w:p>
+                  <w:p>
+                    <w:pPr>
+                      <w:autoSpaceDE w:val="0"/>
+                      <w:autoSpaceDN w:val="0"/>
+                      <w:adjustRightInd w:val="0"/>
+                      <w:rPr>
+                        <w:rFonts w:ascii="Arial" w:hAnsi="Arial" w:cs="Arial"/>
+                        <w:color w:val="525A5D"/>
+                        <w:sz w:val="18"/>
+                        <w:szCs w:val="18"/>
+                      </w:rPr>
+                    </w:pPr>
+                    <w:r>
+                      <w:rPr>
+                        <w:rFonts w:ascii="Arial" w:hAnsi="Arial" w:cs="Arial"/>
+                        <w:color w:val="525A5D"/>
+                        <w:sz w:val="18"/>
+                        <w:szCs w:val="18"/>
+                      </w:rPr>
+                      <w:t xml:space="preserve">e-mail: info@cedaartextile.com </w:t>
+                    </w:r>
+                  </w:p>
+                  <w:p>
+                    <w:pPr>
+                      <w:autoSpaceDE w:val="0"/>
+                      <w:autoSpaceDN w:val="0"/>
+                      <w:adjustRightInd w:val="0"/>
+                      <w:rPr>
+                        <w:rFonts w:ascii="Arial" w:hAnsi="Arial" w:cs="Arial"/>
+                        <w:color w:val="525A5D"/>
+                        <w:sz w:val="18"/>
+                        <w:szCs w:val="18"/>
+                      </w:rPr>
+                    </w:pPr>
+                    <w:r>
+                      <w:rPr>
+                        <w:rFonts w:ascii="Arial" w:hAnsi="Arial" w:cs="Arial"/>
+                        <w:color w:val="525A5D"/>
+                        <w:sz w:val="18"/>
+                        <w:szCs w:val="18"/>
+                      </w:rPr>
+                      <w:t xml:space="preserve">website: </w:t>
+                    </w:r>
+                    <w:hyperlink r:id="rId2" w:history="1">
+                      <w:r>
+                        <w:rPr>
+                          <w:rStyle w:val="Hyperlink"/>
+                          <w:rFonts w:ascii="Arial" w:hAnsi="Arial" w:cs="Arial"/>
+                          <w:sz w:val="18"/>
+                          <w:szCs w:val="18"/>
+                        </w:rPr>
+                        <w:t>www.cedaartextile.com</w:t>
+                      </w:r>
+                    </w:hyperlink>
+                  </w:p>
+                  <w:p>
+                    <w:pPr>
+                      <w:autoSpaceDE w:val="0"/>
+                      <w:autoSpaceDN w:val="0"/>
+                      <w:adjustRightInd w:val="0"/>
+                      <w:rPr>
+                        <w:rFonts w:ascii="Arial" w:hAnsi="Arial" w:cs="Arial"/>
+                        <w:color w:val="525A5D"/>
+                        <w:sz w:val="18"/>
+                        <w:szCs w:val="18"/>
+                      </w:rPr>
+                    </w:pPr>
+                    <w:r>
+                      <w:rPr>
+                        <w:rFonts w:ascii="Arial" w:hAnsi="Arial" w:cs="Arial"/>
+                        <w:color w:val="525A5D"/>
+                        <w:sz w:val="18"/>
+                        <w:szCs w:val="18"/>
+                      </w:rPr>
+                      <w:t>Ph</w:t>
+                    </w:r>
+                    <w:r>
+                      <w:rPr>
+                        <w:rFonts w:ascii="Arial" w:hAnsi="Arial" w:cs="Arial"/>
+                        <w:color w:val="73797F"/>
+                        <w:sz w:val="18"/>
+                        <w:szCs w:val="18"/>
+                      </w:rPr>
+                      <w:t xml:space="preserve">: </w:t>
+                    </w:r>
+                    <w:r>
+                      <w:rPr>
+                        <w:rFonts w:ascii="Arial" w:hAnsi="Arial" w:cs="Arial"/>
+                        <w:color w:val="525A5D"/>
+                        <w:sz w:val="18"/>
+                        <w:szCs w:val="18"/>
+                      </w:rPr>
+                      <w:t>+91-85588-52200</w:t>
+                    </w:r>
+                  </w:p>
+                  <w:p>
+                    <w:pPr>
+                      <w:autoSpaceDE w:val="0"/>
+                      <w:autoSpaceDN w:val="0"/>
+                      <w:adjustRightInd w:val="0"/>
+                      <w:rPr>
+                        <w:rFonts w:ascii="Arial" w:hAnsi="Arial" w:cs="Arial"/>
+                        <w:color w:val="525A5D"/>
+                        <w:sz w:val="18"/>
+                        <w:szCs w:val="18"/>
+                      </w:rPr>
+                    </w:pPr>
+                    <w:r>
+                      <w:rPr>
+                        <w:rFonts w:ascii="Arial" w:hAnsi="Arial" w:cs="Arial"/>
+                        <w:color w:val="525A5D"/>
+                        <w:sz w:val="18"/>
+                        <w:szCs w:val="18"/>
+                      </w:rPr>
+                      <w:t>CIN: U17299KA2020PTC139070</w:t>
+                    </w:r>
+                  </w:p>
+                  <w:p>
+                    <w:pPr>
+                      <w:autoSpaceDE w:val="0"/>
+                      <w:autoSpaceDN w:val="0"/>
+                      <w:adjustRightInd w:val="0"/>
+                      <w:rPr>
+                        <w:rFonts w:ascii="Arial" w:hAnsi="Arial" w:cs="Arial"/>
+                        <w:color w:val="525A5D"/>
+                        <w:sz w:val="18"/>
+                        <w:szCs w:val="18"/>
+                      </w:rPr>
+                    </w:pPr>
+                    <w:r>
+                      <w:rPr>
+                        <w:rFonts w:ascii="Arial" w:hAnsi="Arial" w:cs="Arial"/>
+                        <w:color w:val="525A5D"/>
+                        <w:sz w:val="18"/>
+                        <w:szCs w:val="18"/>
+                      </w:rPr>
+                      <w:t xml:space="preserve">GST: </w:t>
+                    </w:r>
+                    <w:r>
+                      <w:rPr>
+                        <w:rFonts w:ascii="Arial" w:hAnsi="Arial" w:cs="Arial"/>
+                        <w:color w:val="525A5D"/>
+                        <w:sz w:val="18"/>
+                        <w:szCs w:val="18"/>
+                      </w:rPr>
+                      <w:t>03AAJCC0212A1ZR</w:t>
                     </w:r>
                   </w:p>
                   <w:p>
@@ -3496,10 +3703,10 @@
         <w:noProof/>
       </w:rPr>
       <w:drawing>
-        <wp:inline distT="0" distB="0" distL="0" distR="0" wp14:anchorId="3B2598D4" wp14:editId="2C64D68E">
-          <wp:extent cx="891540" cy="572942"/>
-          <wp:effectExtent l="0" t="0" r="3810" b="0"/>
-          <wp:docPr id="10" name="Picture 10" descr="C:\Users\USER\Desktop\IMG-20201122-WA0005.jpg"/>
+        <wp:inline distT="0" distB="0" distL="0" distR="0" wp14:anchorId="63169832" wp14:editId="75BC9998">
+          <wp:extent cx="914286" cy="704762"/>
+          <wp:effectExtent l="0" t="0" r="635" b="635"/>
+          <wp:docPr id="422168691" name="Picture 1" descr="A logo of a company&#10;&#10;Description automatically generated"/>
           <wp:cNvGraphicFramePr>
             <a:graphicFrameLocks xmlns:a="http://schemas.openxmlformats.org/drawingml/2006/main" noChangeAspect="1"/>
           </wp:cNvGraphicFramePr>
@@ -3507,36 +3714,23 @@
             <a:graphicData uri="http://schemas.openxmlformats.org/drawingml/2006/picture">
               <pic:pic xmlns:pic="http://schemas.openxmlformats.org/drawingml/2006/picture">
                 <pic:nvPicPr>
-                  <pic:cNvPr id="0" name="Picture 3" descr="C:\Users\USER\Desktop\IMG-20201122-WA0005.jpg"/>
-                  <pic:cNvPicPr>
-                    <a:picLocks noChangeAspect="1" noChangeArrowheads="1"/>
-                  </pic:cNvPicPr>
+                  <pic:cNvPr id="422168691" name="Picture 1" descr="A logo of a company&#10;&#10;Description automatically generated"/>
+                  <pic:cNvPicPr/>
                 </pic:nvPicPr>
                 <pic:blipFill>
-                  <a:blip r:embed="rId1">
-                    <a:extLst>
-                      <a:ext uri="{28A0092B-C50C-407E-A947-70E740481C1C}">
-                        <a14:useLocalDpi xmlns:a14="http://schemas.microsoft.com/office/drawing/2010/main" val="0"/>
-                      </a:ext>
-                    </a:extLst>
-                  </a:blip>
-                  <a:srcRect/>
+                  <a:blip r:embed="rId3"/>
                   <a:stretch>
                     <a:fillRect/>
                   </a:stretch>
                 </pic:blipFill>
-                <pic:spPr bwMode="auto">
+                <pic:spPr>
                   <a:xfrm>
                     <a:off x="0" y="0"/>
-                    <a:ext cx="954888" cy="613652"/>
+                    <a:ext cx="914286" cy="704762"/>
                   </a:xfrm>
                   <a:prstGeom prst="rect">
                     <a:avLst/>
                   </a:prstGeom>
-                  <a:noFill/>
-                  <a:ln>
-                    <a:noFill/>
-                  </a:ln>
                 </pic:spPr>
               </pic:pic>
             </a:graphicData>
@@ -3578,7 +3772,7 @@
                   <pic:cNvPicPr/>
                 </pic:nvPicPr>
                 <pic:blipFill>
-                  <a:blip r:embed="rId2">
+                  <a:blip r:embed="rId4">
                     <a:extLst>
                       <a:ext uri="{28A0092B-C50C-407E-A947-70E740481C1C}">
                         <a14:useLocalDpi xmlns:a14="http://schemas.microsoft.com/office/drawing/2010/main" val="0"/>
@@ -3637,8 +3831,18 @@
 </w:hdr>
 </file>
 
+<file path=word/header3.xml><?xml version="1.0" encoding="utf-8"?>
+<w:hdr xmlns:wpc="http://schemas.microsoft.com/office/word/2010/wordprocessingCanvas" xmlns:cx="http://schemas.microsoft.com/office/drawing/2014/chartex" xmlns:cx1="http://schemas.microsoft.com/office/drawing/2015/9/8/chartex" xmlns:cx2="http://schemas.microsoft.com/office/drawing/2015/10/21/chartex" xmlns:cx3="http://schemas.microsoft.com/office/drawing/2016/5/9/chartex" xmlns:cx4="http://schemas.microsoft.com/office/drawing/2016/5/10/chartex" xmlns:cx5="http://schemas.microsoft.com/office/drawing/2016/5/11/chartex" xmlns:cx6="http://schemas.microsoft.com/office/drawing/2016/5/12/chartex" xmlns:cx7="http://schemas.microsoft.com/office/drawing/2016/5/13/chartex" xmlns:cx8="http://schemas.microsoft.com/office/drawing/2016/5/14/chartex" xmlns:mc="http://schemas.openxmlformats.org/markup-compatibility/2006" xmlns:aink="http://schemas.microsoft.com/office/drawing/2016/ink" xmlns:am3d="http://schemas.microsoft.com/office/drawing/2017/model3d" xmlns:o="urn:schemas-microsoft-com:office:office" xmlns:oel="http://schemas.microsoft.com/office/2019/extlst" xmlns:r="http://schemas.openxmlformats.org/officeDocument/2006/relationships" xmlns:m="http://schemas.openxmlformats.org/officeDocument/2006/math" xmlns:v="urn:schemas-microsoft-com:vml" xmlns:wp14="http://schemas.microsoft.com/office/word/2010/wordprocessingDrawing" xmlns:wp="http://schemas.openxmlformats.org/drawingml/2006/wordprocessingDrawing" xmlns:w10="urn:schemas-microsoft-com:office:word" xmlns:w="http://schemas.openxmlformats.org/wordprocessingml/2006/main" xmlns:w14="http://schemas.microsoft.com/office/word/2010/wordml" xmlns:w15="http://schemas.microsoft.com/office/word/2012/wordml" xmlns:w16cex="http://schemas.microsoft.com/office/word/2018/wordml/cex" xmlns:w16cid="http://schemas.microsoft.com/office/word/2016/wordml/cid" xmlns:w16="http://schemas.microsoft.com/office/word/2018/wordml" xmlns:w16sdtdh="http://schemas.microsoft.com/office/word/2020/wordml/sdtdatahash" xmlns:w16se="http://schemas.microsoft.com/office/word/2015/wordml/symex" xmlns:wpg="http://schemas.microsoft.com/office/word/2010/wordprocessingGroup" xmlns:wpi="http://schemas.microsoft.com/office/word/2010/wordprocessingInk" xmlns:wne="http://schemas.microsoft.com/office/word/2006/wordml" xmlns:wps="http://schemas.microsoft.com/office/word/2010/wordprocessingShape" mc:Ignorable="w14 w15 w16se w16cid w16 w16cex w16sdtdh wp14">
+  <w:p>
+    <w:pPr>
+      <w:pStyle w:val="Header"/>
+    </w:pPr>
+  </w:p>
+</w:hdr>
+</file>
+
 <file path=word/numbering.xml><?xml version="1.0" encoding="utf-8"?>
-<w:numbering xmlns:wpc="http://schemas.microsoft.com/office/word/2010/wordprocessingCanvas" xmlns:cx="http://schemas.microsoft.com/office/drawing/2014/chartex" xmlns:cx1="http://schemas.microsoft.com/office/drawing/2015/9/8/chartex" xmlns:cx2="http://schemas.microsoft.com/office/drawing/2015/10/21/chartex" xmlns:cx3="http://schemas.microsoft.com/office/drawing/2016/5/9/chartex" xmlns:cx4="http://schemas.microsoft.com/office/drawing/2016/5/10/chartex" xmlns:cx5="http://schemas.microsoft.com/office/drawing/2016/5/11/chartex" xmlns:cx6="http://schemas.microsoft.com/office/drawing/2016/5/12/chartex" xmlns:cx7="http://schemas.microsoft.com/office/drawing/2016/5/13/chartex" xmlns:cx8="http://schemas.microsoft.com/office/drawing/2016/5/14/chartex" xmlns:mc="http://schemas.openxmlformats.org/markup-compatibility/2006" xmlns:aink="http://schemas.microsoft.com/office/drawing/2016/ink" xmlns:am3d="http://schemas.microsoft.com/office/drawing/2017/model3d" xmlns:o="urn:schemas-microsoft-com:office:office" xmlns:r="http://schemas.openxmlformats.org/officeDocument/2006/relationships" xmlns:m="http://schemas.openxmlformats.org/officeDocument/2006/math" xmlns:v="urn:schemas-microsoft-com:vml" xmlns:wp14="http://schemas.microsoft.com/office/word/2010/wordprocessingDrawing" xmlns:wp="http://schemas.openxmlformats.org/drawingml/2006/wordprocessingDrawing" xmlns:w10="urn:schemas-microsoft-com:office:word" xmlns:w="http://schemas.openxmlformats.org/wordprocessingml/2006/main" xmlns:w14="http://schemas.microsoft.com/office/word/2010/wordml" xmlns:w15="http://schemas.microsoft.com/office/word/2012/wordml" xmlns:w16cex="http://schemas.microsoft.com/office/word/2018/wordml/cex" xmlns:w16cid="http://schemas.microsoft.com/office/word/2016/wordml/cid" xmlns:w16="http://schemas.microsoft.com/office/word/2018/wordml" xmlns:w16sdtdh="http://schemas.microsoft.com/office/word/2020/wordml/sdtdatahash" xmlns:w16se="http://schemas.microsoft.com/office/word/2015/wordml/symex" xmlns:wpg="http://schemas.microsoft.com/office/word/2010/wordprocessingGroup" xmlns:wpi="http://schemas.microsoft.com/office/word/2010/wordprocessingInk" xmlns:wne="http://schemas.microsoft.com/office/word/2006/wordml" xmlns:wps="http://schemas.microsoft.com/office/word/2010/wordprocessingShape" mc:Ignorable="w14 w15 w16se w16cid w16 w16cex w16sdtdh wp14">
+<w:numbering xmlns:wpc="http://schemas.microsoft.com/office/word/2010/wordprocessingCanvas" xmlns:cx="http://schemas.microsoft.com/office/drawing/2014/chartex" xmlns:cx1="http://schemas.microsoft.com/office/drawing/2015/9/8/chartex" xmlns:cx2="http://schemas.microsoft.com/office/drawing/2015/10/21/chartex" xmlns:cx3="http://schemas.microsoft.com/office/drawing/2016/5/9/chartex" xmlns:cx4="http://schemas.microsoft.com/office/drawing/2016/5/10/chartex" xmlns:cx5="http://schemas.microsoft.com/office/drawing/2016/5/11/chartex" xmlns:cx6="http://schemas.microsoft.com/office/drawing/2016/5/12/chartex" xmlns:cx7="http://schemas.microsoft.com/office/drawing/2016/5/13/chartex" xmlns:cx8="http://schemas.microsoft.com/office/drawing/2016/5/14/chartex" xmlns:mc="http://schemas.openxmlformats.org/markup-compatibility/2006" xmlns:aink="http://schemas.microsoft.com/office/drawing/2016/ink" xmlns:am3d="http://schemas.microsoft.com/office/drawing/2017/model3d" xmlns:o="urn:schemas-microsoft-com:office:office" xmlns:oel="http://schemas.microsoft.com/office/2019/extlst" xmlns:r="http://schemas.openxmlformats.org/officeDocument/2006/relationships" xmlns:m="http://schemas.openxmlformats.org/officeDocument/2006/math" xmlns:v="urn:schemas-microsoft-com:vml" xmlns:wp14="http://schemas.microsoft.com/office/word/2010/wordprocessingDrawing" xmlns:wp="http://schemas.openxmlformats.org/drawingml/2006/wordprocessingDrawing" xmlns:w10="urn:schemas-microsoft-com:office:word" xmlns:w="http://schemas.openxmlformats.org/wordprocessingml/2006/main" xmlns:w14="http://schemas.microsoft.com/office/word/2010/wordml" xmlns:w15="http://schemas.microsoft.com/office/word/2012/wordml" xmlns:w16cex="http://schemas.microsoft.com/office/word/2018/wordml/cex" xmlns:w16cid="http://schemas.microsoft.com/office/word/2016/wordml/cid" xmlns:w16="http://schemas.microsoft.com/office/word/2018/wordml" xmlns:w16sdtdh="http://schemas.microsoft.com/office/word/2020/wordml/sdtdatahash" xmlns:w16se="http://schemas.microsoft.com/office/word/2015/wordml/symex" xmlns:wpg="http://schemas.microsoft.com/office/word/2010/wordprocessingGroup" xmlns:wpi="http://schemas.microsoft.com/office/word/2010/wordprocessingInk" xmlns:wne="http://schemas.microsoft.com/office/word/2006/wordml" xmlns:wps="http://schemas.microsoft.com/office/word/2010/wordprocessingShape" mc:Ignorable="w14 w15 w16se w16cid w16 w16cex w16sdtdh wp14">
   <w:abstractNum w:abstractNumId="0" w15:restartNumberingAfterBreak="0">
     <w:nsid w:val="19365752"/>
     <w:multiLevelType w:val="hybridMultilevel"/>
@@ -3881,16 +4085,16 @@
       <w:lvlJc w:val="left"/>
     </w:lvl>
   </w:abstractNum>
-  <w:num w:numId="1">
+  <w:num w:numId="1" w16cid:durableId="1916821781">
     <w:abstractNumId w:val="2"/>
   </w:num>
-  <w:num w:numId="2">
+  <w:num w:numId="2" w16cid:durableId="1295254460">
     <w:abstractNumId w:val="3"/>
   </w:num>
-  <w:num w:numId="3">
+  <w:num w:numId="3" w16cid:durableId="276761614">
     <w:abstractNumId w:val="1"/>
   </w:num>
-  <w:num w:numId="4">
+  <w:num w:numId="4" w16cid:durableId="670067952">
     <w:abstractNumId w:val="0"/>
   </w:num>
 </w:numbering>

</xml_diff>